<commit_message>
Intégration de l'autobiographie + finalisation du sommaire (format CERCO)
- Dédicace et remerciements réels (depuis l'autobiographie de l'étudiante)
- Section AUTOBIOGRAPHIE complète insérée avant l'introduction
  (Introduction, parcours familial/scolaire/universitaire, expériences,
  compétences, projet professionnel, conclusion)
- Pages Liste des figures / Liste des tableaux présentes dans les liminaires
- Sommaire (champ TOC) auto-mis à jour à l'ouverture (updateFields=true) :
  Dédicace, Remerciements, Résumé, Abstract, Listes, Autobiographie,
  Introduction, Chapitres 1-11, Conclusion, Bibliographie, Annexes
- Correction d'assemblage (saut de ligne) rétablissant l'Introduction générale
</commit_message>
<xml_diff>
--- a/memoire/Memoire-KOUASSI-ESPERANCE-CERCO.docx
+++ b/memoire/Memoire-KOUASSI-ESPERANCE-CERCO.docx
@@ -26,7 +26,7 @@
               <w:drawing>
                 <wp:inline>
                   <wp:extent cx="1371600" cy="578815"/>
-                  <wp:docPr id="156" name="Picture 156"/>
+                  <wp:docPr id="169" name="Picture 169"/>
                   <wp:cNvGraphicFramePr>
                     <a:graphicFrameLocks noChangeAspect="1"/>
                   </wp:cNvGraphicFramePr>
@@ -70,7 +70,7 @@
               <w:drawing>
                 <wp:inline>
                   <wp:extent cx="822960" cy="822960"/>
-                  <wp:docPr id="157" name="Picture 157"/>
+                  <wp:docPr id="170" name="Picture 170"/>
                   <wp:cNvGraphicFramePr>
                     <a:graphicFrameLocks noChangeAspect="1"/>
                   </wp:cNvGraphicFramePr>
@@ -114,7 +114,7 @@
               <w:drawing>
                 <wp:inline>
                   <wp:extent cx="1005840" cy="847779"/>
-                  <wp:docPr id="158" name="Picture 158"/>
+                  <wp:docPr id="171" name="Picture 171"/>
                   <wp:cNvGraphicFramePr>
                     <a:graphicFrameLocks noChangeAspect="1"/>
                   </wp:cNvGraphicFramePr>
@@ -487,63 +487,61 @@
           <w:iCs/>
           <w:i/>
         </w:rPr>
-        <w:t xml:space="preserve">Je dédie ce travail :</w:t>
-      </w:r>
-    </w:p>
-    <w:p>
-      <w:pPr>
-        <w:pStyle w:val="BodyText"/>
-      </w:pPr>
+        <w:t xml:space="preserve">À mon père, Kouassi Kouassi Alphonse,</w:t>
+      </w:r>
+      <w:r>
+        <w:t xml:space="preserve"> </w:t>
+      </w:r>
       <w:r>
         <w:rPr>
           <w:iCs/>
           <w:i/>
         </w:rPr>
-        <w:t xml:space="preserve">À mes chers parents,</w:t>
-      </w:r>
-      <w:r>
-        <w:t xml:space="preserve"> </w:t>
-      </w:r>
+        <w:t xml:space="preserve">dont la présence et l’amour ont guidé chacun de mes pas.</w:t>
+      </w:r>
+    </w:p>
+    <w:p>
+      <w:pPr>
+        <w:pStyle w:val="BodyText"/>
+      </w:pPr>
       <w:r>
         <w:rPr>
           <w:iCs/>
           <w:i/>
         </w:rPr>
-        <w:t xml:space="preserve">pour leur amour, leurs sacrifices et leur soutien indéfectible ;</w:t>
-      </w:r>
-    </w:p>
-    <w:p>
-      <w:pPr>
-        <w:pStyle w:val="BodyText"/>
-      </w:pPr>
+        <w:t xml:space="preserve">À ma mère, Mukandangamiye Félicité,</w:t>
+      </w:r>
+      <w:r>
+        <w:t xml:space="preserve"> </w:t>
+      </w:r>
       <w:r>
         <w:rPr>
           <w:iCs/>
           <w:i/>
         </w:rPr>
-        <w:t xml:space="preserve">À toute ma famille et à mes proches,</w:t>
-      </w:r>
-      <w:r>
-        <w:t xml:space="preserve"> </w:t>
-      </w:r>
+        <w:t xml:space="preserve">toi qui as espéré et cru, même quand tout semblait perdu.</w:t>
+      </w:r>
+    </w:p>
+    <w:p>
+      <w:pPr>
+        <w:pStyle w:val="BodyText"/>
+      </w:pPr>
       <w:r>
         <w:rPr>
           <w:iCs/>
           <w:i/>
         </w:rPr>
-        <w:t xml:space="preserve">pour leurs encouragements constants ;</w:t>
-      </w:r>
-    </w:p>
-    <w:p>
-      <w:pPr>
-        <w:pStyle w:val="BodyText"/>
-      </w:pPr>
+        <w:t xml:space="preserve">À mes frères,</w:t>
+      </w:r>
+      <w:r>
+        <w:t xml:space="preserve"> </w:t>
+      </w:r>
       <w:r>
         <w:rPr>
           <w:iCs/>
           <w:i/>
         </w:rPr>
-        <w:t xml:space="preserve">À mes enseignants du département RIT,</w:t>
+        <w:t xml:space="preserve">et tout particulièrement à mon frère Kouassi Christian,</w:t>
       </w:r>
       <w:r>
         <w:t xml:space="preserve"> </w:t>
@@ -553,7 +551,7 @@
           <w:iCs/>
           <w:i/>
         </w:rPr>
-        <w:t xml:space="preserve">qui ont éclairé mon parcours ;</w:t>
+        <w:t xml:space="preserve">pour votre affection indéfectible et votre foi en moi.</w:t>
       </w:r>
     </w:p>
     <w:p>
@@ -565,17 +563,7 @@
           <w:iCs/>
           <w:i/>
         </w:rPr>
-        <w:t xml:space="preserve">À mes camarades de promotion,</w:t>
-      </w:r>
-      <w:r>
-        <w:t xml:space="preserve"> </w:t>
-      </w:r>
-      <w:r>
-        <w:rPr>
-          <w:iCs/>
-          <w:i/>
-        </w:rPr>
-        <w:t xml:space="preserve">pour les moments de partage et d’entraide.</w:t>
+        <w:t xml:space="preserve">— Ce travail vous est humblement et affectueusement dédié —</w:t>
       </w:r>
     </w:p>
     <w:p>
@@ -651,43 +639,62 @@
         <w:pStyle w:val="BodyText"/>
       </w:pPr>
       <w:r>
-        <w:t xml:space="preserve">Je remercie l’ensemble du</w:t>
-      </w:r>
-      <w:r>
-        <w:t xml:space="preserve"> </w:t>
-      </w:r>
-      <w:r>
-        <w:rPr>
-          <w:bCs/>
-          <w:b/>
-        </w:rPr>
-        <w:t xml:space="preserve">corps professoral du département Réseaux</w:t>
-      </w:r>
-      <w:r>
-        <w:rPr>
-          <w:bCs/>
-          <w:b/>
-        </w:rPr>
-        <w:t xml:space="preserve"> </w:t>
-      </w:r>
-      <w:r>
-        <w:rPr>
-          <w:bCs/>
-          <w:b/>
-        </w:rPr>
-        <w:t xml:space="preserve">Informatique et Télécommunication</w:t>
-      </w:r>
-      <w:r>
-        <w:t xml:space="preserve"> </w:t>
-      </w:r>
-      <w:r>
-        <w:t xml:space="preserve">pour la formation solide dispensée durant</w:t>
-      </w:r>
-      <w:r>
-        <w:t xml:space="preserve"> </w:t>
-      </w:r>
-      <w:r>
-        <w:t xml:space="preserve">ces années d’études.</w:t>
+        <w:t xml:space="preserve">Ma reconnaissance va également à</w:t>
+      </w:r>
+      <w:r>
+        <w:t xml:space="preserve"> </w:t>
+      </w:r>
+      <w:r>
+        <w:rPr>
+          <w:bCs/>
+          <w:b/>
+        </w:rPr>
+        <w:t xml:space="preserve">Monsieur Maxime LOKOSSOU</w:t>
+      </w:r>
+      <w:r>
+        <w:t xml:space="preserve">, assistant</w:t>
+      </w:r>
+      <w:r>
+        <w:t xml:space="preserve"> </w:t>
+      </w:r>
+      <w:r>
+        <w:t xml:space="preserve">directeur de mémoire, dont les contributions ont été déterminantes dans la</w:t>
+      </w:r>
+      <w:r>
+        <w:t xml:space="preserve"> </w:t>
+      </w:r>
+      <w:r>
+        <w:t xml:space="preserve">structuration de la démarche, ainsi qu’à</w:t>
+      </w:r>
+      <w:r>
+        <w:t xml:space="preserve"> </w:t>
+      </w:r>
+      <w:r>
+        <w:rPr>
+          <w:bCs/>
+          <w:b/>
+        </w:rPr>
+        <w:t xml:space="preserve">Monsieur MASSOLOKONON Tadagbe</w:t>
+      </w:r>
+      <w:r>
+        <w:rPr>
+          <w:bCs/>
+          <w:b/>
+        </w:rPr>
+        <w:t xml:space="preserve"> </w:t>
+      </w:r>
+      <w:r>
+        <w:rPr>
+          <w:bCs/>
+          <w:b/>
+        </w:rPr>
+        <w:t xml:space="preserve">Landry</w:t>
+      </w:r>
+      <w:r>
+        <w:t xml:space="preserve"> </w:t>
+      </w:r>
+      <w:r>
+        <w:t xml:space="preserve">pour son soutien constant et ses précieux conseils.</w:t>
       </w:r>
     </w:p>
     <w:p>
@@ -695,29 +702,104 @@
         <w:pStyle w:val="BodyText"/>
       </w:pPr>
       <w:r>
-        <w:t xml:space="preserve">J’adresse également ma gratitude aux</w:t>
-      </w:r>
-      <w:r>
-        <w:t xml:space="preserve"> </w:t>
-      </w:r>
-      <w:r>
-        <w:rPr>
-          <w:bCs/>
-          <w:b/>
-        </w:rPr>
-        <w:t xml:space="preserve">membres du jury</w:t>
-      </w:r>
-      <w:r>
-        <w:t xml:space="preserve"> </w:t>
-      </w:r>
-      <w:r>
-        <w:t xml:space="preserve">pour l’honneur qu’ils</w:t>
-      </w:r>
-      <w:r>
-        <w:t xml:space="preserve"> </w:t>
-      </w:r>
-      <w:r>
-        <w:t xml:space="preserve">me font d’évaluer ce mémoire, ainsi qu’à ma</w:t>
+        <w:t xml:space="preserve">Une pensée fraternelle va à mes grands frères de cœur,</w:t>
+      </w:r>
+      <w:r>
+        <w:t xml:space="preserve"> </w:t>
+      </w:r>
+      <w:r>
+        <w:rPr>
+          <w:bCs/>
+          <w:b/>
+        </w:rPr>
+        <w:t xml:space="preserve">OUATTARA IVIDA Samuel</w:t>
+      </w:r>
+      <w:r>
+        <w:t xml:space="preserve"> </w:t>
+      </w:r>
+      <w:r>
+        <w:t xml:space="preserve">et</w:t>
+      </w:r>
+      <w:r>
+        <w:t xml:space="preserve"> </w:t>
+      </w:r>
+      <w:r>
+        <w:rPr>
+          <w:bCs/>
+          <w:b/>
+        </w:rPr>
+        <w:t xml:space="preserve">ADOU JESUS KANGA Jonas BEUGRE</w:t>
+      </w:r>
+      <w:r>
+        <w:t xml:space="preserve">, ainsi qu’à ma sœur de cœur</w:t>
+      </w:r>
+      <w:r>
+        <w:t xml:space="preserve"> </w:t>
+      </w:r>
+      <w:r>
+        <w:rPr>
+          <w:bCs/>
+          <w:b/>
+        </w:rPr>
+        <w:t xml:space="preserve">Seungri</w:t>
+      </w:r>
+      <w:r>
+        <w:rPr>
+          <w:bCs/>
+          <w:b/>
+        </w:rPr>
+        <w:t xml:space="preserve"> </w:t>
+      </w:r>
+      <w:r>
+        <w:rPr>
+          <w:bCs/>
+          <w:b/>
+        </w:rPr>
+        <w:t xml:space="preserve">Adebayo</w:t>
+      </w:r>
+      <w:r>
+        <w:t xml:space="preserve">, pour leur soutien moral et leurs encouragements constants.</w:t>
+      </w:r>
+    </w:p>
+    <w:p>
+      <w:pPr>
+        <w:pStyle w:val="BodyText"/>
+      </w:pPr>
+      <w:r>
+        <w:t xml:space="preserve">Je remercie sincèrement ma collègue</w:t>
+      </w:r>
+      <w:r>
+        <w:t xml:space="preserve"> </w:t>
+      </w:r>
+      <w:r>
+        <w:rPr>
+          <w:bCs/>
+          <w:b/>
+        </w:rPr>
+        <w:t xml:space="preserve">Nora YAPO</w:t>
+      </w:r>
+      <w:r>
+        <w:t xml:space="preserve">, qui m’a initiée et guidée</w:t>
+      </w:r>
+      <w:r>
+        <w:t xml:space="preserve"> </w:t>
+      </w:r>
+      <w:r>
+        <w:t xml:space="preserve">dans le domaine de la gestion de la clientèle, partageant avec générosité son</w:t>
+      </w:r>
+      <w:r>
+        <w:t xml:space="preserve"> </w:t>
+      </w:r>
+      <w:r>
+        <w:t xml:space="preserve">expérience et son expertise professionnelle.</w:t>
+      </w:r>
+    </w:p>
+    <w:p>
+      <w:pPr>
+        <w:pStyle w:val="BodyText"/>
+      </w:pPr>
+      <w:r>
+        <w:t xml:space="preserve">Je remercie du fond du cœur ma</w:t>
       </w:r>
       <w:r>
         <w:t xml:space="preserve"> </w:t>
@@ -733,29 +815,25 @@
         <w:t xml:space="preserve"> </w:t>
       </w:r>
       <w:r>
-        <w:t xml:space="preserve">et à mes</w:t>
-      </w:r>
-      <w:r>
-        <w:t xml:space="preserve"> </w:t>
-      </w:r>
-      <w:r>
-        <w:rPr>
-          <w:bCs/>
-          <w:b/>
-        </w:rPr>
-        <w:t xml:space="preserve">amis</w:t>
-      </w:r>
-      <w:r>
-        <w:t xml:space="preserve"> </w:t>
-      </w:r>
-      <w:r>
-        <w:t xml:space="preserve">pour</w:t>
-      </w:r>
-      <w:r>
-        <w:t xml:space="preserve"> </w:t>
-      </w:r>
-      <w:r>
-        <w:t xml:space="preserve">leur soutien moral constant.</w:t>
+        <w:t xml:space="preserve">— mon père, ma mère, mes sœurs et mon</w:t>
+      </w:r>
+      <w:r>
+        <w:t xml:space="preserve"> </w:t>
+      </w:r>
+      <w:r>
+        <w:t xml:space="preserve">frère — pour leur soutien moral indéfectible, leur patience et leurs</w:t>
+      </w:r>
+      <w:r>
+        <w:t xml:space="preserve"> </w:t>
+      </w:r>
+      <w:r>
+        <w:t xml:space="preserve">encouragements constants tout au long de ce parcours académique. Leur amour a</w:t>
+      </w:r>
+      <w:r>
+        <w:t xml:space="preserve"> </w:t>
+      </w:r>
+      <w:r>
+        <w:t xml:space="preserve">été ma plus grande force.</w:t>
       </w:r>
     </w:p>
     <w:p>
@@ -763,20 +841,49 @@
         <w:pStyle w:val="BodyText"/>
       </w:pPr>
       <w:r>
-        <w:t xml:space="preserve">À toutes et à tous,</w:t>
-      </w:r>
-      <w:r>
-        <w:t xml:space="preserve"> </w:t>
-      </w:r>
-      <w:r>
-        <w:rPr>
-          <w:bCs/>
-          <w:b/>
-        </w:rPr>
-        <w:t xml:space="preserve">merci</w:t>
-      </w:r>
-      <w:r>
-        <w:t xml:space="preserve">.</w:t>
+        <w:t xml:space="preserve">Un remerciement particulier va à toutes mes</w:t>
+      </w:r>
+      <w:r>
+        <w:t xml:space="preserve"> </w:t>
+      </w:r>
+      <w:r>
+        <w:rPr>
+          <w:bCs/>
+          <w:b/>
+        </w:rPr>
+        <w:t xml:space="preserve">camarades de promotion</w:t>
+      </w:r>
+      <w:r>
+        <w:t xml:space="preserve"> </w:t>
+      </w:r>
+      <w:r>
+        <w:t xml:space="preserve">avec</w:t>
+      </w:r>
+      <w:r>
+        <w:t xml:space="preserve"> </w:t>
+      </w:r>
+      <w:r>
+        <w:t xml:space="preserve">lesquelles j’ai partagé les joies et les difficultés de ces années d’études.</w:t>
+      </w:r>
+    </w:p>
+    <w:p>
+      <w:pPr>
+        <w:pStyle w:val="BodyText"/>
+      </w:pPr>
+      <w:r>
+        <w:t xml:space="preserve">Enfin, je remercie toutes les personnes qui, de près ou de loin, ont contribué à</w:t>
+      </w:r>
+      <w:r>
+        <w:t xml:space="preserve"> </w:t>
+      </w:r>
+      <w:r>
+        <w:t xml:space="preserve">la réalisation de ce mémoire. Que chacun trouve ici l’expression de ma profonde</w:t>
+      </w:r>
+      <w:r>
+        <w:t xml:space="preserve"> </w:t>
+      </w:r>
+      <w:r>
+        <w:t xml:space="preserve">et sincère gratitude.</w:t>
       </w:r>
     </w:p>
     <w:p>
@@ -3488,12 +3595,903 @@
       </w:r>
     </w:p>
     <w:bookmarkEnd w:id="26"/>
-    <w:bookmarkStart w:id="27" w:name="introduction-générale"/>
+    <w:bookmarkStart w:id="39" w:name="autobiographie"/>
     <w:p>
       <w:pPr>
         <w:pStyle w:val="Heading1"/>
       </w:pPr>
       <w:r>
+        <w:t xml:space="preserve">AUTOBIOGRAPHIE</w:t>
+      </w:r>
+    </w:p>
+    <w:bookmarkStart w:id="27" w:name="introduction"/>
+    <w:p>
+      <w:pPr>
+        <w:pStyle w:val="Heading4"/>
+      </w:pPr>
+      <w:r>
+        <w:t xml:space="preserve">Introduction</w:t>
+      </w:r>
+    </w:p>
+    <w:p>
+      <w:pPr>
+        <w:pStyle w:val="FirstParagraph"/>
+      </w:pPr>
+      <w:r>
+        <w:t xml:space="preserve">La rédaction d’une autobiographie, dans le cadre d’un mémoire de fin de cycle, représente bien plus qu’un simple exercice académique. Elle constitue une démarche réflexive et introspective, qui invite à revisiter l’ensemble des étapes d’une vie, à en mesurer les apports, les défis et les transformations. C’est dans cet esprit que je me prête à cet exercice, avec sincérité et engagement.</w:t>
+      </w:r>
+    </w:p>
+    <w:p>
+      <w:pPr>
+        <w:pStyle w:val="BodyText"/>
+      </w:pPr>
+      <w:r>
+        <w:t xml:space="preserve">Je me nomme Kouassi Yoo Nyong Kra Espérance. J’ai 24 ans. Née et élevée à Yopougon, dans le quartier Camp Militaire, à Abidjan, en Côte d’Ivoire, j’ai grandi dans un environnement familial et communautaire qui m’a profondément façonnée. Titulaire d’un Baccalauréat série D et d’une Licence en Informatique, je poursuis aujourd’hui un Master 2 en Réseaux et Informatique/Télécommunications (RIT) à CERCO.</w:t>
+      </w:r>
+    </w:p>
+    <w:p>
+      <w:pPr>
+        <w:pStyle w:val="BodyText"/>
+      </w:pPr>
+      <w:r>
+        <w:t xml:space="preserve">Mon parcours est marqué par la résilience, la persévérance et une ambition claire : me hisser au rang des professionnels compétents dans le domaine des technologies de l’information et de la communication, contribuer activement au développement du secteur numérique ivoirien, et incarner les valeurs de travail et d’excellence que m’ont inculquées ma famille et mes expériences de vie.</w:t>
+      </w:r>
+    </w:p>
+    <w:p>
+      <w:pPr>
+        <w:pStyle w:val="BodyText"/>
+      </w:pPr>
+      <w:r>
+        <w:t xml:space="preserve">La présente autobiographie retrace les grandes étapes de ce parcours : mes origines familiales et sociales, mon cursus scolaire et universitaire, mes expériences professionnelles et associatives, mes compétences, mon projet de carrière ainsi que les motivations profondes qui sous-tendent le thème de mon mémoire. Chaque section constitue un fragment d’une histoire en construction, celle d’une femme déterminée à réussir malgré les obstacles, et à contribuer, à sa mesure, à l’édification d’une Côte d’Ivoire numérique.</w:t>
+      </w:r>
+    </w:p>
+    <w:bookmarkEnd w:id="27"/>
+    <w:bookmarkStart w:id="28" w:name="i.-origines-et-cadre-familial"/>
+    <w:p>
+      <w:pPr>
+        <w:pStyle w:val="Heading4"/>
+      </w:pPr>
+      <w:r>
+        <w:t xml:space="preserve">I. Origines et cadre familial</w:t>
+      </w:r>
+    </w:p>
+    <w:p>
+      <w:pPr>
+        <w:pStyle w:val="FirstParagraph"/>
+      </w:pPr>
+      <w:r>
+        <w:t xml:space="preserve">Toute destinée humaine prend racine dans son histoire familiale. La mienne ne déroge pas à cette règle. Je suis la fille unique de ma mère, et cette singularité revêt une signification particulièrement forte dans mon histoire personnelle.</w:t>
+      </w:r>
+    </w:p>
+    <w:p>
+      <w:pPr>
+        <w:pStyle w:val="BodyText"/>
+      </w:pPr>
+      <w:r>
+        <w:t xml:space="preserve">Ma mère, après plusieurs grossesses douloureusement interrompues par des fausses couches successives, s’était vue annoncer par des médecins qu’elle ne pourrait plus donner la vie. Cette sentence médicale, lourde à porter pour toute femme, ne l’a pourtant pas brisée. Elle a continué d’espérer, de prier, de croire. Et c’est dans ce contexte empreint de douleur mais aussi d’une foi inébranlable, que je suis née. C’est précisément pour cette raison que l’on m’a prénommée Espérance : je suis, pour ma famille et particulièrement pour ma mère, le symbole vivant que l’espoir ne meurt jamais, et que la persévérance finit toujours par porter ses fruits.</w:t>
+      </w:r>
+    </w:p>
+    <w:p>
+      <w:pPr>
+        <w:pStyle w:val="BodyText"/>
+      </w:pPr>
+      <w:r>
+        <w:t xml:space="preserve">Je suis également le septième enfant de mon père, ce qui fait de moi un membre d’une famille recomposée. Grandir dans cette configuration familiale m’a permis de développer très tôt une aptitude à l’adaptation, à la coexistence avec des personnalités diverses et à la gestion des relations humaines complexes. La cellule familiale élargie, avec ses frères et sœurs issus de différentes unions, m’a offert un espace d’apprentissage informel riche en enseignements sur la solidarité, le respect mutuel et la gestion des conflits.</w:t>
+      </w:r>
+    </w:p>
+    <w:p>
+      <w:pPr>
+        <w:pStyle w:val="BodyText"/>
+      </w:pPr>
+      <w:r>
+        <w:t xml:space="preserve">C’est dans le quartier Camp Militaire de Yopougon que j’ai grandi. Yopougon, commune populaire et vibrante d’Abidjan, est connue pour son effervescence culturelle, son dynamisme social et la diversité de sa population. Grandir dans ce quartier, c’est apprendre à naviguer entre des réalités sociales contrastées, à faire preuve de débrouillardise et à cultiver un esprit de solidarité communautaire. Ces valeurs, ancrées dès mon enfance, ont fortement influencé ma vision du monde et ma façon d’aborder les défis de la vie.</w:t>
+      </w:r>
+    </w:p>
+    <w:p>
+      <w:pPr>
+        <w:pStyle w:val="BodyText"/>
+      </w:pPr>
+      <w:r>
+        <w:t xml:space="preserve">Mon cadre familial, bien que modeste sur le plan matériel, m’a offert des richesses inestimables : l’amour inconditionnel de mes parents, l’enseignement de la résilience face aux épreuves, le sens des responsabilités et la conviction que l’éducation est la clé du progrès individuel et collectif. Ces fondements ont guidé chacune de mes décisions et continuent d’orienter mon parcours académique et professionnel.</w:t>
+      </w:r>
+    </w:p>
+    <w:bookmarkEnd w:id="28"/>
+    <w:bookmarkStart w:id="29" w:name="ii.-parcours-scolaire"/>
+    <w:p>
+      <w:pPr>
+        <w:pStyle w:val="Heading4"/>
+      </w:pPr>
+      <w:r>
+        <w:t xml:space="preserve">II. Parcours scolaire</w:t>
+      </w:r>
+    </w:p>
+    <w:p>
+      <w:pPr>
+        <w:pStyle w:val="FirstParagraph"/>
+      </w:pPr>
+      <w:r>
+        <w:rPr>
+          <w:bCs/>
+          <w:b/>
+        </w:rPr>
+        <w:t xml:space="preserve">1. L’enseignement primaire et les premières années de collège</w:t>
+      </w:r>
+    </w:p>
+    <w:p>
+      <w:pPr>
+        <w:pStyle w:val="BodyText"/>
+      </w:pPr>
+      <w:r>
+        <w:t xml:space="preserve">Mes premières années scolaires ont posé les bases d’un rapport au savoir que je qualifierais de curieux et engagé. Dès le primaire, j’ai manifesté un intérêt particulier pour les matières scientifiques, notamment les mathématiques et les sciences naturelles, qui stimulaient mon goût pour la logique et l’analyse.</w:t>
+      </w:r>
+    </w:p>
+    <w:p>
+      <w:pPr>
+        <w:pStyle w:val="BodyText"/>
+      </w:pPr>
+      <w:r>
+        <w:t xml:space="preserve">C’est au collège Phalène 1 que j’ai effectué l’essentiel de mon enseignement secondaire du premier cycle, de la classe de sixième jusqu’en troisième. Ces années au collège ont été pour moi une période de construction intellectuelle et personnelle intense. J’ai appris à m’organiser, à travailler de manière régulière et à m’investir dans les activités parascolaires qui permettent de développer des compétences complémentaires à celles acquises en classe.</w:t>
+      </w:r>
+    </w:p>
+    <w:p>
+      <w:pPr>
+        <w:pStyle w:val="BodyText"/>
+      </w:pPr>
+      <w:r>
+        <w:t xml:space="preserve">À l’issue de ce premier cycle d’enseignement secondaire, j’ai obtenu le Brevet d’Études du Premier Cycle (BEPC), consacrant ainsi une première étape importante dans mon parcours académique.</w:t>
+      </w:r>
+    </w:p>
+    <w:p>
+      <w:pPr>
+        <w:pStyle w:val="BodyText"/>
+      </w:pPr>
+      <w:r>
+        <w:rPr>
+          <w:bCs/>
+          <w:b/>
+        </w:rPr>
+        <w:t xml:space="preserve">2. Le lycée et l’obtention du Baccalauréat</w:t>
+      </w:r>
+    </w:p>
+    <w:p>
+      <w:pPr>
+        <w:pStyle w:val="BodyText"/>
+      </w:pPr>
+      <w:r>
+        <w:t xml:space="preserve">Après le BEPC, j’ai intégré le lycée des jeunes de Yopougon pour la poursuite de mes études secondaires. C’est là que j’ai opéré un choix déterminant : celui de la série D, filière scientifique orientée vers les sciences de la vie et de la terre, combinées aux mathématiques et à la physique-chimie.</w:t>
+      </w:r>
+    </w:p>
+    <w:p>
+      <w:pPr>
+        <w:pStyle w:val="BodyText"/>
+      </w:pPr>
+      <w:r>
+        <w:t xml:space="preserve">Ce choix ne s’est pas fait au hasard. Il reflétait ma conviction profonde que les sciences constituent un socle indispensable pour appréhender le monde dans sa complexité et pour contribuer à son évolution. La série D m’a permis de développer un esprit d’analyse et de synthèse, une rigueur méthodologique et une capacité à résoudre des problèmes complexes, autant de qualités qui se sont révélées précieuses dans la suite de mon parcours en informatique et en réseaux.</w:t>
+      </w:r>
+    </w:p>
+    <w:p>
+      <w:pPr>
+        <w:pStyle w:val="BodyText"/>
+      </w:pPr>
+      <w:r>
+        <w:t xml:space="preserve">Les années lycée n’ont pas été sans difficultés. Comme tout élève, j’ai traversé des périodes de doute, des moments où la pression des examens et les exigences du programme semblaient insurmontables. Mais à chaque fois, c’est ma détermination et le soutien de ma famille qui m’ont permis de surmonter ces obstacles. J’ai également trouvé dans mes professeurs des modèles d’engagement et de rigueur intellectuelle qui ont renforcé ma passion pour les sciences.</w:t>
+      </w:r>
+    </w:p>
+    <w:p>
+      <w:pPr>
+        <w:pStyle w:val="BodyText"/>
+      </w:pPr>
+      <w:r>
+        <w:t xml:space="preserve">En 2020, au terme de ces années de travail acharné, j’ai obtenu mon Baccalauréat série D. Cette réussite a été vécue comme une véritable victoire, non seulement personnelle, mais aussi familiale. Elle ouvrait la voie à l’enseignement supérieur et à la réalisation de mon projet de vie.</w:t>
+      </w:r>
+    </w:p>
+    <w:bookmarkEnd w:id="29"/>
+    <w:bookmarkStart w:id="30" w:name="iii.-parcours-universitaire"/>
+    <w:p>
+      <w:pPr>
+        <w:pStyle w:val="Heading4"/>
+      </w:pPr>
+      <w:r>
+        <w:t xml:space="preserve">III. Parcours universitaire</w:t>
+      </w:r>
+    </w:p>
+    <w:p>
+      <w:pPr>
+        <w:pStyle w:val="FirstParagraph"/>
+      </w:pPr>
+      <w:r>
+        <w:rPr>
+          <w:bCs/>
+          <w:b/>
+        </w:rPr>
+        <w:t xml:space="preserve">1. La formation en Licence à l’UNISAT</w:t>
+      </w:r>
+    </w:p>
+    <w:p>
+      <w:pPr>
+        <w:pStyle w:val="BodyText"/>
+      </w:pPr>
+      <w:r>
+        <w:t xml:space="preserve">Fort de mon baccalauréat en poche, j’ai été orientée à l’UNISAT (Université des Sciences Appliquées et de Technologies), où j’ai entamé une formation en informatique. Ce choix de filière a été la concrétisation d’une inclination naturelle pour les technologies numériques, perceptible dès mes années de lycée.</w:t>
+      </w:r>
+    </w:p>
+    <w:p>
+      <w:pPr>
+        <w:pStyle w:val="BodyText"/>
+      </w:pPr>
+      <w:r>
+        <w:t xml:space="preserve">La formation en Licence à l’UNISAT m’a offert un socle théorique et pratique solide dans plusieurs domaines fondamentaux de l’informatique. J’y ai acquis des compétences en réseaux informatiques, notamment la conception, la configuration et l’administration de réseaux locaux et étendus. J’ai également été formée aux systèmes d’exploitation, avec une maîtrise progressive des environnements Linux et Windows, essentiels dans le monde professionnel de l’informatique.</w:t>
+      </w:r>
+    </w:p>
+    <w:p>
+      <w:pPr>
+        <w:pStyle w:val="BodyText"/>
+      </w:pPr>
+      <w:r>
+        <w:t xml:space="preserve">La programmation a constitué un autre pilier de ma formation. J’ai appris les bases des langages de programmation et développé une logique algorithmique qui me permet d’aborder les problèmes informatiques avec méthode. Enfin, les bases de données ont été au cœur d’une partie importante de ma formation, avec l’apprentissage de la conception de systèmes de gestion de bases de données relationnelles et l’utilisation du langage SQL.</w:t>
+      </w:r>
+    </w:p>
+    <w:p>
+      <w:pPr>
+        <w:pStyle w:val="BodyText"/>
+      </w:pPr>
+      <w:r>
+        <w:t xml:space="preserve">Ces trois années de Licence ont également été l’occasion de réaliser des projets en groupe, expériences qui m’ont appris à collaborer, à partager les responsabilités et à mener un projet à son terme dans le respect des délais et des contraintes fixées. Ces compétences transversales sont aujourd’hui au cœur de mon approche professionnelle.</w:t>
+      </w:r>
+    </w:p>
+    <w:p>
+      <w:pPr>
+        <w:pStyle w:val="BodyText"/>
+      </w:pPr>
+      <w:r>
+        <w:t xml:space="preserve">En 2023, j’ai obtenu ma Licence en Informatique, couronnant trois années d’efforts et d’apprentissage. Cette réussite a confirmé ma vocation pour l’informatique et les télécommunications, et renforcé ma motivation à poursuivre vers des études de Master.</w:t>
+      </w:r>
+    </w:p>
+    <w:p>
+      <w:pPr>
+        <w:pStyle w:val="BodyText"/>
+      </w:pPr>
+      <w:r>
+        <w:rPr>
+          <w:bCs/>
+          <w:b/>
+        </w:rPr>
+        <w:t xml:space="preserve">2. L’interruption et la reprise des études</w:t>
+      </w:r>
+    </w:p>
+    <w:p>
+      <w:pPr>
+        <w:pStyle w:val="BodyText"/>
+      </w:pPr>
+      <w:r>
+        <w:t xml:space="preserve">Le chemin vers la réussite est rarement linéaire. Le mien ne fait pas exception. Après l’obtention de ma Licence, j’ai été contrainte d’interrompre mes études pendant une année entière, en raison de difficultés financières que ma famille n’était pas en mesure de surmonter immédiatement.</w:t>
+      </w:r>
+    </w:p>
+    <w:p>
+      <w:pPr>
+        <w:pStyle w:val="BodyText"/>
+      </w:pPr>
+      <w:r>
+        <w:t xml:space="preserve">Cette période d’interruption aurait pu être vécue comme un échec ou une capitulation. Mais j’ai choisi de la transformer en opportunité de croissance personnelle. Loin de rester passive, j’ai mis à profit ce temps pour apporter mon aide à mes parents dans diverses activités génératrices de revenus, contribuant ainsi à rassembler progressivement les ressources nécessaires pour financer la suite de mes études.</w:t>
+      </w:r>
+    </w:p>
+    <w:p>
+      <w:pPr>
+        <w:pStyle w:val="BodyText"/>
+      </w:pPr>
+      <w:r>
+        <w:t xml:space="preserve">Cette expérience m’a confrontée à la réalité économique du quotidien, aux contraintes financières que doivent affronter de nombreux étudiants ivoiriens et à la nécessité de faire preuve d’ingéniosité et de persévérance face à l’adversité. Elle a renforcé mon sens des responsabilités et ma conviction que les obstacles ne sont que des étapes vers la réussite.</w:t>
+      </w:r>
+    </w:p>
+    <w:p>
+      <w:pPr>
+        <w:pStyle w:val="BodyText"/>
+      </w:pPr>
+      <w:r>
+        <w:t xml:space="preserve">En 2024, avec une détermination renouvelée, je me suis inscrite à CERCO pour entamer un Master 2 en Réseaux et Informatique/Télécommunications. Cette reprise a été marquée par un engagement encore plus fort, une maturité accrue et une vision plus claire de mon projet professionnel.</w:t>
+      </w:r>
+    </w:p>
+    <w:bookmarkEnd w:id="30"/>
+    <w:bookmarkStart w:id="31" w:name="X50b343d331b28bc21a400f9ad048dff9171e074"/>
+    <w:p>
+      <w:pPr>
+        <w:pStyle w:val="Heading4"/>
+      </w:pPr>
+      <w:r>
+        <w:t xml:space="preserve">IV. Expérience pratique en administration réseau</w:t>
+      </w:r>
+    </w:p>
+    <w:p>
+      <w:pPr>
+        <w:pStyle w:val="FirstParagraph"/>
+      </w:pPr>
+      <w:r>
+        <w:t xml:space="preserve">L’une des expériences les plus formatrices de mon parcours a sans conteste été ma participation à une mission d’administration réseau au sein de l’Institut Universitaire de Grand-Bassam (IUGB). Cette expérience pratique sur le terrain m’a permis de confronter les connaissances théoriques acquises en cours à la complexité et à l’imprévisibilité des environnements réseau réels.</w:t>
+      </w:r>
+    </w:p>
+    <w:p>
+      <w:pPr>
+        <w:pStyle w:val="BodyText"/>
+      </w:pPr>
+      <w:r>
+        <w:rPr>
+          <w:bCs/>
+          <w:b/>
+        </w:rPr>
+        <w:t xml:space="preserve">1. Le contexte et l’infrastructure</w:t>
+      </w:r>
+    </w:p>
+    <w:p>
+      <w:pPr>
+        <w:pStyle w:val="BodyText"/>
+      </w:pPr>
+      <w:r>
+        <w:t xml:space="preserve">L’IUGB dispose d’une infrastructure réseau de campus de grande envergure, conçue pour répondre aux besoins d’une institution universitaire moderne. Cette infrastructure comprenait notamment un routeur Huawei AR6140, pièce maîtresse de l’architecture réseau, assurant le routage inter-VLAN et la connexion à Internet. Des commutateurs CloudEngine et S5735, également de la marque Huawei, assuraient la commutation au niveau des accès et de la distribution. Un contrôleur Omada centralisait la gestion des points d’accès sans fil, au nombre de 86 unités de la marque TP-Link, répartis sur l’ensemble des bâtiments du campus et organisés en plusieurs VLANs distincts.</w:t>
+      </w:r>
+    </w:p>
+    <w:p>
+      <w:pPr>
+        <w:pStyle w:val="BodyText"/>
+      </w:pPr>
+      <w:r>
+        <w:t xml:space="preserve">Cette architecture, bien que robuste dans sa conception, présentait un certain nombre de dysfonctionnements et de points de fragilité qui nécessitaient une intervention méthodique et rigoureuse.</w:t>
+      </w:r>
+    </w:p>
+    <w:p>
+      <w:pPr>
+        <w:pStyle w:val="BodyText"/>
+      </w:pPr>
+      <w:r>
+        <w:rPr>
+          <w:bCs/>
+          <w:b/>
+        </w:rPr>
+        <w:t xml:space="preserve">2. Les problématiques rencontrées</w:t>
+      </w:r>
+    </w:p>
+    <w:p>
+      <w:pPr>
+        <w:pStyle w:val="BodyText"/>
+      </w:pPr>
+      <w:r>
+        <w:t xml:space="preserve">Au cours de cette mission, j’ai été confrontée à des problématiques techniques réelles et variées, qui m’ont permis de développer une approche diagnostic approfondie :</w:t>
+      </w:r>
+    </w:p>
+    <w:p>
+      <w:pPr>
+        <w:pStyle w:val="BodyText"/>
+      </w:pPr>
+      <w:r>
+        <w:t xml:space="preserve">La saturation de la bande passante, phénomène courant dans les environnements universitaires à forte densité d’utilisateurs, qui entraînait des ralentissements importants et une dégradation significative de la qualité de service.</w:t>
+      </w:r>
+    </w:p>
+    <w:p>
+      <w:pPr>
+        <w:pStyle w:val="BodyText"/>
+      </w:pPr>
+      <w:r>
+        <w:t xml:space="preserve">Des erreurs de routage par défaut, qui provoquaient des pertes de connectivité intermittentes et des anomalies dans le transit des paquets entre les différents segments réseau.</w:t>
+      </w:r>
+    </w:p>
+    <w:p>
+      <w:pPr>
+        <w:pStyle w:val="BodyText"/>
+      </w:pPr>
+      <w:r>
+        <w:t xml:space="preserve">Des conflits ARP (Address Resolution Protocol), source de perturbations dans la communication entre les équipements du réseau local, pouvant aller jusqu’à des interruptions de service.</w:t>
+      </w:r>
+    </w:p>
+    <w:p>
+      <w:pPr>
+        <w:pStyle w:val="BodyText"/>
+      </w:pPr>
+      <w:r>
+        <w:t xml:space="preserve">Un portail captif défaillant, élément critique de la gestion des accès au réseau sans fil, dont les dysfonctionnements empêchaient les utilisateurs de s’authentifier et d’accéder aux ressources réseau.</w:t>
+      </w:r>
+    </w:p>
+    <w:p>
+      <w:pPr>
+        <w:pStyle w:val="BodyText"/>
+      </w:pPr>
+      <w:r>
+        <w:rPr>
+          <w:bCs/>
+          <w:b/>
+        </w:rPr>
+        <w:t xml:space="preserve">3. Ma contribution et les apprentissages</w:t>
+      </w:r>
+    </w:p>
+    <w:p>
+      <w:pPr>
+        <w:pStyle w:val="BodyText"/>
+      </w:pPr>
+      <w:r>
+        <w:t xml:space="preserve">Face à ces défis, j’ai contribué activement au diagnostic et à la résolution des incidents. Ma démarche a été fondée sur une approche méthodique : identification précise des symptômes, analyse des journaux système, tests de connectivité, et recherche de solutions documentées, avant la mise en œuvre des corrections retenues.</w:t>
+      </w:r>
+    </w:p>
+    <w:p>
+      <w:pPr>
+        <w:pStyle w:val="BodyText"/>
+      </w:pPr>
+      <w:r>
+        <w:t xml:space="preserve">Cette expérience m’a appris que l’administration réseau ne se limite pas à la configuration initiale des équipements, mais implique une surveillance constante, une capacité à anticiper les problèmes et une réactivité face aux incidents. Elle m’a également démontré l’importance d’une documentation rigoureuse et d’une communication efficace au sein des équipes techniques.</w:t>
+      </w:r>
+    </w:p>
+    <w:p>
+      <w:pPr>
+        <w:pStyle w:val="BodyText"/>
+      </w:pPr>
+      <w:r>
+        <w:t xml:space="preserve">Sur le plan humain, cette mission m’a confortée dans ma vocation pour les métiers des réseaux et m’a donné une première expérience concrète du terrain, indispensable pour tout professionnel de l’informatique souhaitant avoir un impact réel sur les organisations.</w:t>
+      </w:r>
+    </w:p>
+    <w:bookmarkEnd w:id="31"/>
+    <w:bookmarkStart w:id="32" w:name="v.-expérience-en-gestion-de-la-clientèle"/>
+    <w:p>
+      <w:pPr>
+        <w:pStyle w:val="Heading4"/>
+      </w:pPr>
+      <w:r>
+        <w:t xml:space="preserve">V. Expérience en gestion de la clientèle</w:t>
+      </w:r>
+    </w:p>
+    <w:p>
+      <w:pPr>
+        <w:pStyle w:val="FirstParagraph"/>
+      </w:pPr>
+      <w:r>
+        <w:t xml:space="preserve">En parallèle de mon parcours académique et technique, j’ai eu l’opportunité d’acquérir une expérience professionnelle dans le domaine de la gestion de la clientèle, au sein de l’entreprise OPEN. Cette expérience, bien que différente dans sa nature de mes activités liées aux réseaux informatiques, s’est révélée d’une richesse considérable pour mon développement personnel et professionnel.</w:t>
+      </w:r>
+    </w:p>
+    <w:p>
+      <w:pPr>
+        <w:pStyle w:val="BodyText"/>
+      </w:pPr>
+      <w:r>
+        <w:t xml:space="preserve">Travailler au contact direct des clients m’a permis de développer et d’affiner plusieurs compétences essentielles dans le monde professionnel d’aujourd’hui. La communication, d’abord : savoir écouter activement, reformuler les attentes du client, expliquer clairement des concepts parfois techniques et adapter son discours en fonction de son interlocuteur sont des aptitudes que j’ai considérablement renforcées au cours de cette expérience.</w:t>
+      </w:r>
+    </w:p>
+    <w:p>
+      <w:pPr>
+        <w:pStyle w:val="BodyText"/>
+      </w:pPr>
+      <w:r>
+        <w:t xml:space="preserve">L’écoute active a été particulièrement mise en avant dans ce rôle. Comprendre les besoins réels d’un client, souvent exprimés de manière imprécise ou partielle, et être capable d’y apporter une réponse adaptée et satisfaisante, constitue un véritable art qui s’apprend par la pratique et la répétition.</w:t>
+      </w:r>
+    </w:p>
+    <w:p>
+      <w:pPr>
+        <w:pStyle w:val="BodyText"/>
+      </w:pPr>
+      <w:r>
+        <w:t xml:space="preserve">La gestion des relations professionnelles, dans ses dimensions à la fois relationnelles et organisationnelles, a également été au cœur de mon quotidien dans ce poste. Gérer des clients aux profils variés, parfois exigeants ou insatisfaits, en maintenant en toutes circonstances un niveau élevé de professionnalisme et de courtoisie, m’a dotée d’une solide maîtrise de moi-même et d’une grande capacité à gérer les situations de tension.</w:t>
+      </w:r>
+    </w:p>
+    <w:p>
+      <w:pPr>
+        <w:pStyle w:val="BodyText"/>
+      </w:pPr>
+      <w:r>
+        <w:t xml:space="preserve">Sur un plan plus profond, cette expérience m’a permis de mieux comprendre l’importance de l’utilisateur final dans la conception et la gestion des systèmes informatiques. Trop souvent, les professionnels des technologies de l’information ont tendance à raisonner en termes de performance technique, en oubliant que le véritable objectif de tout système informatique est de répondre aux besoins concrets des utilisateurs. Mon expérience en gestion de la clientèle m’a définitivement ancrée dans cette conviction : la dimension humaine doit être au centre de toute démarche technologique.</w:t>
+      </w:r>
+    </w:p>
+    <w:bookmarkEnd w:id="32"/>
+    <w:bookmarkStart w:id="33" w:name="vi.-engagement-associatif-et-bénévolat"/>
+    <w:p>
+      <w:pPr>
+        <w:pStyle w:val="Heading4"/>
+      </w:pPr>
+      <w:r>
+        <w:t xml:space="preserve">VI. Engagement associatif et bénévolat</w:t>
+      </w:r>
+    </w:p>
+    <w:p>
+      <w:pPr>
+        <w:pStyle w:val="FirstParagraph"/>
+      </w:pPr>
+      <w:r>
+        <w:t xml:space="preserve">Au-delà de mes activités académiques et professionnelles, je me suis engagée dans plusieurs organisations bénévoles, convaincue que la responsabilité sociale est indissociable d’un parcours de vie accompli. Cet engagement associatif constitue une dimension importante de mon identité et de mes valeurs.</w:t>
+      </w:r>
+    </w:p>
+    <w:p>
+      <w:pPr>
+        <w:pStyle w:val="BodyText"/>
+      </w:pPr>
+      <w:r>
+        <w:t xml:space="preserve">Au sein de ces organisations, j’ai eu l’opportunité de piloter et de participer à différents projets à vocation sociale, culturelle ou éducative. Ces expériences m’ont placée dans des situations qui développent des compétences rarement enseignées dans le cadre académique traditionnel.</w:t>
+      </w:r>
+    </w:p>
+    <w:p>
+      <w:pPr>
+        <w:pStyle w:val="BodyText"/>
+      </w:pPr>
+      <w:r>
+        <w:t xml:space="preserve">Le leadership, d’abord. Piloter un projet bénévole, c’est apprendre à mobiliser des équipes sans avoir recours à l’autorité hiérarchique, à fédérer autour d’une vision commune, à motiver et à inspirer des personnes aux profils et aux motivations diverses. Cette forme de leadership dit « partagé » est aujourd’hui considérée comme l’une des plus efficaces dans les organisations modernes, et je l’ai pratiquée et éprouvée sur le terrain.</w:t>
+      </w:r>
+    </w:p>
+    <w:p>
+      <w:pPr>
+        <w:pStyle w:val="BodyText"/>
+      </w:pPr>
+      <w:r>
+        <w:t xml:space="preserve">Le travail en équipe a également été une dimension centrale de mon engagement associatif. Collaborer avec des bénévoles issus d’horizons différents, gérer les divergences d’opinion et construire des consensus, sont des aptitudes que j’ai fortement développées au fil de mes expériences associatives.</w:t>
+      </w:r>
+    </w:p>
+    <w:p>
+      <w:pPr>
+        <w:pStyle w:val="BodyText"/>
+      </w:pPr>
+      <w:r>
+        <w:t xml:space="preserve">La gestion de projets, dans sa dimension opérationnelle — planification, organisation des ressources, suivi des activités, évaluation des résultats — a également fait partie de mes responsabilités dans le cadre associatif. Ces compétences se révèlent aujourd’hui directement transférables dans le monde professionnel, notamment dans la gestion de projets informatiques.</w:t>
+      </w:r>
+    </w:p>
+    <w:p>
+      <w:pPr>
+        <w:pStyle w:val="BodyText"/>
+      </w:pPr>
+      <w:r>
+        <w:t xml:space="preserve">Enfin, cet engagement bénévole reflète une conviction fondamentale : la réussite individuelle n’a de véritable sens que si elle contribue au bien-être collectif. Il est de la responsabilité de chacun, à son niveau et avec ses moyens, de contribuer positivement à la société. C’est dans cet esprit que j’envisage également mon futur rôle professionnel, comme une contribution au développement numérique de la Côte d’Ivoire.</w:t>
+      </w:r>
+    </w:p>
+    <w:bookmarkEnd w:id="33"/>
+    <w:bookmarkStart w:id="34" w:name="vii.-compétences-acquises"/>
+    <w:p>
+      <w:pPr>
+        <w:pStyle w:val="Heading4"/>
+      </w:pPr>
+      <w:r>
+        <w:t xml:space="preserve">VII. Compétences acquises</w:t>
+      </w:r>
+    </w:p>
+    <w:p>
+      <w:pPr>
+        <w:pStyle w:val="FirstParagraph"/>
+      </w:pPr>
+      <w:r>
+        <w:rPr>
+          <w:bCs/>
+          <w:b/>
+        </w:rPr>
+        <w:t xml:space="preserve">1. Compétences techniques</w:t>
+      </w:r>
+    </w:p>
+    <w:p>
+      <w:pPr>
+        <w:pStyle w:val="BodyText"/>
+      </w:pPr>
+      <w:r>
+        <w:t xml:space="preserve">Mon parcours académique et professionnel m’a permis de constituer un portefeuille de compétences techniques solide, en constante évolution :</w:t>
+      </w:r>
+    </w:p>
+    <w:p>
+      <w:pPr>
+        <w:pStyle w:val="BodyText"/>
+      </w:pPr>
+      <w:r>
+        <w:t xml:space="preserve">Administration réseau : configuration et gestion d’équipements réseau (routeurs Huawei, commutateurs CloudEngine/S5735, points d’accès TP-Link), maîtrise des protocoles TCP/IP, VLAN, routage inter-VLAN, et notions de gestion du trafic réseau.</w:t>
+      </w:r>
+    </w:p>
+    <w:p>
+      <w:pPr>
+        <w:pStyle w:val="BodyText"/>
+      </w:pPr>
+      <w:r>
+        <w:t xml:space="preserve">Systèmes d’exploitation Linux : administration de serveurs sous Linux, gestion des utilisateurs et des permissions, utilisation de la ligne de commande, notions de scripting Bash.</w:t>
+      </w:r>
+    </w:p>
+    <w:p>
+      <w:pPr>
+        <w:pStyle w:val="BodyText"/>
+      </w:pPr>
+      <w:r>
+        <w:t xml:space="preserve">Supervision réseau : initiation aux outils de surveillance et de monitoring des infrastructures réseau, compréhension des enjeux de la gestion proactive des incidents.</w:t>
+      </w:r>
+    </w:p>
+    <w:p>
+      <w:pPr>
+        <w:pStyle w:val="BodyText"/>
+      </w:pPr>
+      <w:r>
+        <w:t xml:space="preserve">Bases de données : conception et manipulation de bases de données relationnelles, maîtrise du langage SQL.</w:t>
+      </w:r>
+    </w:p>
+    <w:p>
+      <w:pPr>
+        <w:pStyle w:val="BodyText"/>
+      </w:pPr>
+      <w:r>
+        <w:t xml:space="preserve">Programmation : notions en langages de programmation, développement d’une logique algorithmique appliquée à la résolution de problèmes informatiques.</w:t>
+      </w:r>
+    </w:p>
+    <w:p>
+      <w:pPr>
+        <w:pStyle w:val="BodyText"/>
+      </w:pPr>
+      <w:r>
+        <w:rPr>
+          <w:bCs/>
+          <w:b/>
+        </w:rPr>
+        <w:t xml:space="preserve">2. Compétences transversales</w:t>
+      </w:r>
+    </w:p>
+    <w:p>
+      <w:pPr>
+        <w:pStyle w:val="BodyText"/>
+      </w:pPr>
+      <w:r>
+        <w:t xml:space="preserve">En parallèle de ces compétences techniques, j’ai développé un ensemble de soft skills essentiels à l’exercice des métiers de l’informatique dans un environnement professionnel exigeant :</w:t>
+      </w:r>
+    </w:p>
+    <w:p>
+      <w:pPr>
+        <w:pStyle w:val="BodyText"/>
+      </w:pPr>
+      <w:r>
+        <w:t xml:space="preserve">Organisation et gestion du temps : capacité à gérer simultanément plusieurs projets, à établir des priorités et à respecter les délais.</w:t>
+      </w:r>
+    </w:p>
+    <w:p>
+      <w:pPr>
+        <w:pStyle w:val="BodyText"/>
+      </w:pPr>
+      <w:r>
+        <w:t xml:space="preserve">Leadership et management d’équipe : aptitude à mobiliser et à coordonner des équipes pluridisciplinaires, développée dans le cadre de mes engagements associatifs.</w:t>
+      </w:r>
+    </w:p>
+    <w:p>
+      <w:pPr>
+        <w:pStyle w:val="BodyText"/>
+      </w:pPr>
+      <w:r>
+        <w:t xml:space="preserve">Communication professionnelle : aisance à communiquer aussi bien avec des profils techniques qu’avec des interlocuteurs non techniques, compétence renforcée par mon expérience en gestion de la clientèle.</w:t>
+      </w:r>
+    </w:p>
+    <w:p>
+      <w:pPr>
+        <w:pStyle w:val="BodyText"/>
+      </w:pPr>
+      <w:r>
+        <w:t xml:space="preserve">Résilience et adaptabilité : capacité éprouvée à faire face aux situations difficiles et à rebondir positivement, forgée par les épreuves personnelles traversées.</w:t>
+      </w:r>
+    </w:p>
+    <w:p>
+      <w:pPr>
+        <w:pStyle w:val="BodyText"/>
+      </w:pPr>
+      <w:r>
+        <w:t xml:space="preserve">Sens des responsabilités : engagement constant à assumer pleinement ses missions et à en rendre compte avec honnêteté et transparence.</w:t>
+      </w:r>
+    </w:p>
+    <w:bookmarkEnd w:id="34"/>
+    <w:bookmarkStart w:id="35" w:name="viii.-choix-du-thème-de-mémoire"/>
+    <w:p>
+      <w:pPr>
+        <w:pStyle w:val="Heading4"/>
+      </w:pPr>
+      <w:r>
+        <w:t xml:space="preserve">VIII. Choix du thème de mémoire</w:t>
+      </w:r>
+    </w:p>
+    <w:p>
+      <w:pPr>
+        <w:pStyle w:val="FirstParagraph"/>
+      </w:pPr>
+      <w:r>
+        <w:t xml:space="preserve">Le choix du thème de mon mémoire de fin de cycle n’est pas le fruit du hasard. Il s’inscrit dans la continuité naturelle de mon parcours académique, de mes expériences pratiques et de ma réflexion sur les enjeux actuels du secteur des technologies de l’information.</w:t>
+      </w:r>
+    </w:p>
+    <w:p>
+      <w:pPr>
+        <w:pStyle w:val="BodyText"/>
+      </w:pPr>
+      <w:r>
+        <w:t xml:space="preserve">Mon thème porte sur l’automatisation de la supervision réseau. Ce sujet m’a été inspiré directement par mon expérience à l’IUGB, où j’ai pu mesurer de manière concrète les limites d’une gestion réseau réactive, fondée sur le traitement des incidents après leur survenue. Face à des infrastructures de plus en plus complexes, comprenant des dizaines d’équipements hétérogènes et des centaines d’utilisateurs simultanés, les approches traditionnelles de supervision montrent rapidement leurs limites.</w:t>
+      </w:r>
+    </w:p>
+    <w:p>
+      <w:pPr>
+        <w:pStyle w:val="BodyText"/>
+      </w:pPr>
+      <w:r>
+        <w:t xml:space="preserve">L’automatisation de la supervision réseau répond à un besoin réel et croissant des organisations : détecter les anomalies de manière proactive, avant qu’elles ne se transforment en incidents majeurs ; réduire les temps de réponse face aux dysfonctionnements ; optimiser l’utilisation des ressources réseau ; et libérer les équipes techniques des tâches répétitives à faible valeur ajoutée, pour les concentrer sur des activités à plus fort impact stratégique.</w:t>
+      </w:r>
+    </w:p>
+    <w:p>
+      <w:pPr>
+        <w:pStyle w:val="BodyText"/>
+      </w:pPr>
+      <w:r>
+        <w:t xml:space="preserve">Ce thème est également en phase avec les grandes tendances technologiques actuelles, notamment l’adoption croissante des pratiques DevOps et AIOps dans la gestion des infrastructures informatiques, l’essor des outils open-source de monitoring comme Zabbix, Nagios ou Prometheus, et l’intégration progressive de l’intelligence artificielle dans les processus de gestion des réseaux.</w:t>
+      </w:r>
+    </w:p>
+    <w:p>
+      <w:pPr>
+        <w:pStyle w:val="BodyText"/>
+      </w:pPr>
+      <w:r>
+        <w:t xml:space="preserve">En choisissant ce thème, j’ambitionne de produire un travail qui soit non seulement académiquement rigoureux, mais aussi pratiquement utile pour les organisations ivoiriennes et africaines désireuses de moderniser leurs pratiques de gestion réseau.</w:t>
+      </w:r>
+    </w:p>
+    <w:bookmarkEnd w:id="35"/>
+    <w:bookmarkStart w:id="36" w:name="ix.-projet-professionnel"/>
+    <w:p>
+      <w:pPr>
+        <w:pStyle w:val="Heading4"/>
+      </w:pPr>
+      <w:r>
+        <w:t xml:space="preserve">IX. Projet professionnel</w:t>
+      </w:r>
+    </w:p>
+    <w:p>
+      <w:pPr>
+        <w:pStyle w:val="FirstParagraph"/>
+      </w:pPr>
+      <w:r>
+        <w:t xml:space="preserve">À l’issue de ma formation en Master 2, mon projet professionnel est clairement défini, articulé autour de deux axes principaux : l’expertise technique dans les domaines des réseaux et de la cybersécurité, et la contribution au développement du secteur numérique en Côte d’Ivoire.</w:t>
+      </w:r>
+    </w:p>
+    <w:p>
+      <w:pPr>
+        <w:pStyle w:val="BodyText"/>
+      </w:pPr>
+      <w:r>
+        <w:t xml:space="preserve">Sur le plan technique, je souhaite exercer en tant qu’ingénieure en administration réseau et cybersécurité. Les infrastructures réseaux constituent l’épine dorsale de toute organisation moderne, et leur sécurisation est devenue un enjeu stratégique majeur à l’heure où les cybermenaces se multiplient et se sophistiquent. Je veux être au cœur de cette dynamique, contribuer à la conception d’architectures réseau robustes et sécurisées, et participer activement à la protection des systèmes d’information des organisations.</w:t>
+      </w:r>
+    </w:p>
+    <w:p>
+      <w:pPr>
+        <w:pStyle w:val="BodyText"/>
+      </w:pPr>
+      <w:r>
+        <w:t xml:space="preserve">À plus court terme, mon objectif est de rejoindre une organisation — entreprise privée, institution publique ou opérateur de télécommunications — où je pourrai mettre en pratique les compétences acquises au cours de ma formation et les approfondir au contact de professionnels expérimentés. Je souhaite évoluer dans un environnement stimulant, qui valorise l’initiative, la créativité et la formation continue.</w:t>
+      </w:r>
+    </w:p>
+    <w:p>
+      <w:pPr>
+        <w:pStyle w:val="BodyText"/>
+      </w:pPr>
+      <w:r>
+        <w:t xml:space="preserve">À moyen terme, j’envisage de me spécialiser davantage dans le domaine de la cybersécurité, en passant des certifications reconnues internationalement — telles que le CCNA (Cisco Certified Network Associate), le CompTIA Security+ ou le Certified Ethical Hacker (CEH) — qui viendront renforcer mon employabilité et ma crédibilité professionnelle.</w:t>
+      </w:r>
+    </w:p>
+    <w:p>
+      <w:pPr>
+        <w:pStyle w:val="BodyText"/>
+      </w:pPr>
+      <w:r>
+        <w:t xml:space="preserve">À long terme, mon ambition est de contribuer activement au développement du secteur numérique en Côte d’Ivoire. Ce pays, engagé dans une dynamique de transformation digitale ambitieuse, a besoin de professionnels compétents et engagés pour accompagner cette transition. Je veux être l’une de ces professionnelles, et pourquoi pas, à terme, créer ma propre structure spécialisée dans la sécurité des systèmes d’information et le conseil en infrastructure réseau.</w:t>
+      </w:r>
+    </w:p>
+    <w:bookmarkEnd w:id="36"/>
+    <w:bookmarkStart w:id="37" w:name="x.-centres-dintérêt-et-personnalité"/>
+    <w:p>
+      <w:pPr>
+        <w:pStyle w:val="Heading4"/>
+      </w:pPr>
+      <w:r>
+        <w:t xml:space="preserve">X. Centres d’intérêt et personnalité</w:t>
+      </w:r>
+    </w:p>
+    <w:p>
+      <w:pPr>
+        <w:pStyle w:val="FirstParagraph"/>
+      </w:pPr>
+      <w:r>
+        <w:t xml:space="preserve">La personne que l’on est ne saurait se réduire à son seul parcours académique et professionnel. C’est pourquoi cette autobiographie serait incomplète sans un regard sur mes centres d’intérêt et les traits de personnalité qui me définissent.</w:t>
+      </w:r>
+    </w:p>
+    <w:p>
+      <w:pPr>
+        <w:pStyle w:val="BodyText"/>
+      </w:pPr>
+      <w:r>
+        <w:t xml:space="preserve">Je suis avant tout une femme curieuse, animée par un désir permanent de comprendre, d’explorer et de découvrir. Cette curiosité, qui a nourri mon attrait pour les sciences et la technologie, se manifeste également dans ma passion pour les voyages.</w:t>
+      </w:r>
+    </w:p>
+    <w:p>
+      <w:pPr>
+        <w:pStyle w:val="BodyText"/>
+      </w:pPr>
+      <w:r>
+        <w:t xml:space="preserve">Voyager, pour moi, c’est bien plus que déplacer son corps d’un lieu à un autre. C’est une démarche d’ouverture au monde, une invitation à dépasser ses certitudes et ses habitudes, à s’enrichir au contact d’autres cultures, d’autres modes de vie, d’autres façons de penser. Chaque voyage est une leçon d’humilité et d’émerveillement. Chaque rencontre avec d’autres peuples et d’autres traditions nourrit ma compréhension de la diversité humaine et renforce mon sens de l’empathie.</w:t>
+      </w:r>
+    </w:p>
+    <w:p>
+      <w:pPr>
+        <w:pStyle w:val="BodyText"/>
+      </w:pPr>
+      <w:r>
+        <w:t xml:space="preserve">Cette passion pour les voyages est profondément liée à mon rapport au monde professionnel. Les professionnels qui ont une expérience internationale, qui ont été confrontés à des contextes culturels différents, sont généralement plus créatifs, plus adaptables et plus capables de travailler en équipes multiculturelles. Je nourris l’ambition de développer cette dimension internationale tout au long de ma carrière.</w:t>
+      </w:r>
+    </w:p>
+    <w:p>
+      <w:pPr>
+        <w:pStyle w:val="BodyText"/>
+      </w:pPr>
+      <w:r>
+        <w:t xml:space="preserve">Sur le plan de la personnalité, je me définirais comme quelqu’un de déterminé, persévérant et empathique. Ma détermination s’est forgée dans les épreuves traversées — les difficultés financières, l’interruption des études — et s’exprime aujourd’hui dans mon engagement sans faille dans mes projets académiques et professionnels. Ma persévérance est le moteur qui m’a permis de ne jamais abandonner, même dans les moments les plus difficiles. Mon empathie, enfin, est ce qui me permet de comprendre les besoins des autres, qu’il s’agisse de clients, de collaborateurs ou d’utilisateurs, et de proposer des solutions adaptées à leurs réalités.</w:t>
+      </w:r>
+    </w:p>
+    <w:bookmarkEnd w:id="37"/>
+    <w:bookmarkStart w:id="38" w:name="conclusion"/>
+    <w:p>
+      <w:pPr>
+        <w:pStyle w:val="Heading4"/>
+      </w:pPr>
+      <w:r>
+        <w:t xml:space="preserve">Conclusion</w:t>
+      </w:r>
+    </w:p>
+    <w:p>
+      <w:pPr>
+        <w:pStyle w:val="FirstParagraph"/>
+      </w:pPr>
+      <w:r>
+        <w:t xml:space="preserve">Au terme de cette autobiographie, je mesure le chemin parcouru depuis mes premières années scolaires à Yopougon jusqu’à la rédaction de ce mémoire de Master 2. Un chemin marqué par des étapes significatives, des défis parfois intenses, mais aussi par des réussites qui ont jalonné et enrichi mon parcours.</w:t>
+      </w:r>
+    </w:p>
+    <w:p>
+      <w:pPr>
+        <w:pStyle w:val="BodyText"/>
+      </w:pPr>
+      <w:r>
+        <w:t xml:space="preserve">Chaque expérience — qu’il s’agisse des années de lycée qui ont forgé ma rigueur intellectuelle, de la formation en Licence qui a posé les fondements de mes compétences techniques, de l’interruption difficile qui a renforcé ma résilience, de la mission à l’IUGB qui m’a confrontée à la réalité du terrain, ou encore de mon engagement associatif qui a développé mon sens des responsabilités — a contribué à construire la professionnelle et la personne que je suis aujourd’hui.</w:t>
+      </w:r>
+    </w:p>
+    <w:p>
+      <w:pPr>
+        <w:pStyle w:val="BodyText"/>
+      </w:pPr>
+      <w:r>
+        <w:t xml:space="preserve">Je suis convaincue que la réussite dans le domaine des technologies de l’information ne repose pas seulement sur des compétences techniques. Elle requiert également des qualités humaines — la curiosité intellectuelle, la persévérance, l’empathie, le sens de l’éthique — qui permettent de mettre la technologie au service du bien commun.</w:t>
+      </w:r>
+    </w:p>
+    <w:p>
+      <w:pPr>
+        <w:pStyle w:val="BodyText"/>
+      </w:pPr>
+      <w:r>
+        <w:t xml:space="preserve">C’est dans cet esprit que j’aborde la rédaction de mon mémoire sur l’automatisation de la supervision réseau, et plus largement, la construction de mon projet professionnel. Il ne s’agit pas simplement d’acquérir des diplômes ou des certifications, mais de devenir une professionnelle compétente, engagée et responsable, capable de contribuer activement au développement numérique de la Côte d’Ivoire et de l’Afrique.</w:t>
+      </w:r>
+    </w:p>
+    <w:p>
+      <w:pPr>
+        <w:pStyle w:val="BodyText"/>
+      </w:pPr>
+      <w:r>
+        <w:t xml:space="preserve">L’histoire que j’ai commencé à écrire est encore loin d’être terminée. Les pages qui s’ouvrent devant moi sont pleines de promesses et de défis à relever. Et je les aborde avec la même détermination, la même curiosité et la même foi en l’avenir qui ont toujours guidé mes pas. Car c’est bien là le sens profond de mon prénom : Espérance.</w:t>
+      </w:r>
+    </w:p>
+    <w:p>
+      <w:pPr>
+        <w:pStyle w:val="BodyText"/>
+      </w:pPr>
+      <w:r>
+        <w:t xml:space="preserve">Kouassi Yoo Nyong Kra Espérance</w:t>
+      </w:r>
+    </w:p>
+    <w:p>
+      <w:pPr>
+        <w:pStyle w:val="BodyText"/>
+      </w:pPr>
+      <w:r>
+        <w:t xml:space="preserve">Abidjan, 2025</w:t>
+      </w:r>
+    </w:p>
+    <w:p>
+      <w:r>
+        <w:br w:type="page"/>
+      </w:r>
+    </w:p>
+    <w:bookmarkEnd w:id="38"/>
+    <w:bookmarkEnd w:id="39"/>
+    <w:bookmarkStart w:id="40" w:name="introduction-générale"/>
+    <w:p>
+      <w:pPr>
+        <w:pStyle w:val="Heading1"/>
+      </w:pPr>
+      <w:r>
         <w:t xml:space="preserve">INTRODUCTION GÉNÉRALE</w:t>
       </w:r>
     </w:p>
@@ -4223,8 +5221,8 @@
         <w:br w:type="page"/>
       </w:r>
     </w:p>
-    <w:bookmarkEnd w:id="27"/>
-    <w:bookmarkStart w:id="35" w:name="X5ffdc43deef35488232e33bcc48791b0dd2729c"/>
+    <w:bookmarkEnd w:id="40"/>
+    <w:bookmarkStart w:id="48" w:name="X5ffdc43deef35488232e33bcc48791b0dd2729c"/>
     <w:p>
       <w:pPr>
         <w:pStyle w:val="Heading1"/>
@@ -4233,7 +5231,7 @@
         <w:t xml:space="preserve">CHAPITRE 1 — CONTEXTE ET IDENTIFICATION DU PROBLÈME</w:t>
       </w:r>
     </w:p>
-    <w:bookmarkStart w:id="28" w:name="contexte-général"/>
+    <w:bookmarkStart w:id="41" w:name="contexte-général"/>
     <w:p>
       <w:pPr>
         <w:pStyle w:val="Heading2"/>
@@ -4428,8 +5426,8 @@
         <w:t xml:space="preserve">.</w:t>
       </w:r>
     </w:p>
-    <w:bookmarkEnd w:id="28"/>
-    <w:bookmarkStart w:id="29" w:name="la-supervision-réseau-aujourdhui"/>
+    <w:bookmarkEnd w:id="41"/>
+    <w:bookmarkStart w:id="42" w:name="la-supervision-réseau-aujourdhui"/>
     <w:p>
       <w:pPr>
         <w:pStyle w:val="Heading2"/>
@@ -4599,8 +5597,8 @@
         <w:t xml:space="preserve">de l’ensemble des équipements.</w:t>
       </w:r>
     </w:p>
-    <w:bookmarkEnd w:id="29"/>
-    <w:bookmarkStart w:id="30" w:name="constat-et-formulation-du-problème"/>
+    <w:bookmarkEnd w:id="42"/>
+    <w:bookmarkStart w:id="43" w:name="constat-et-formulation-du-problème"/>
     <w:p>
       <w:pPr>
         <w:pStyle w:val="Heading2"/>
@@ -4950,8 +5948,8 @@
         <w:t xml:space="preserve">de service et de la maîtrise des coûts.</w:t>
       </w:r>
     </w:p>
-    <w:bookmarkEnd w:id="30"/>
-    <w:bookmarkStart w:id="33" w:name="questions-de-recherche"/>
+    <w:bookmarkEnd w:id="43"/>
+    <w:bookmarkStart w:id="46" w:name="questions-de-recherche"/>
     <w:p>
       <w:pPr>
         <w:pStyle w:val="Heading2"/>
@@ -4960,7 +5958,7 @@
         <w:t xml:space="preserve">1.4 Questions de recherche</w:t>
       </w:r>
     </w:p>
-    <w:bookmarkStart w:id="31" w:name="question-principale"/>
+    <w:bookmarkStart w:id="44" w:name="question-principale"/>
     <w:p>
       <w:pPr>
         <w:pStyle w:val="Heading3"/>
@@ -5037,8 +6035,8 @@
         <w:t xml:space="preserve">sur des outils open-source ?</w:t>
       </w:r>
     </w:p>
-    <w:bookmarkEnd w:id="31"/>
-    <w:bookmarkStart w:id="32" w:name="questions-secondaires"/>
+    <w:bookmarkEnd w:id="44"/>
+    <w:bookmarkStart w:id="45" w:name="questions-secondaires"/>
     <w:p>
       <w:pPr>
         <w:pStyle w:val="Heading3"/>
@@ -5119,9 +6117,9 @@
         <w:t xml:space="preserve">détection, le temps de réaction et le taux de disponibilité, et à quel coût ?</w:t>
       </w:r>
     </w:p>
-    <w:bookmarkEnd w:id="32"/>
-    <w:bookmarkEnd w:id="33"/>
-    <w:bookmarkStart w:id="34" w:name="justification-et-intérêt-du-sujet"/>
+    <w:bookmarkEnd w:id="45"/>
+    <w:bookmarkEnd w:id="46"/>
+    <w:bookmarkStart w:id="47" w:name="justification-et-intérêt-du-sujet"/>
     <w:p>
       <w:pPr>
         <w:pStyle w:val="Heading2"/>
@@ -5251,9 +6249,9 @@
         <w:br w:type="page"/>
       </w:r>
     </w:p>
-    <w:bookmarkEnd w:id="34"/>
-    <w:bookmarkEnd w:id="35"/>
-    <w:bookmarkStart w:id="40" w:name="X97267b109fdb6d0dc266257c99819d2fd4d3826"/>
+    <w:bookmarkEnd w:id="47"/>
+    <w:bookmarkEnd w:id="48"/>
+    <w:bookmarkStart w:id="53" w:name="X97267b109fdb6d0dc266257c99819d2fd4d3826"/>
     <w:p>
       <w:pPr>
         <w:pStyle w:val="Heading1"/>
@@ -5262,7 +6260,7 @@
         <w:t xml:space="preserve">CHAPITRE 2 — OBJECTIFS ET RÉSULTATS ATTENDUS</w:t>
       </w:r>
     </w:p>
-    <w:bookmarkStart w:id="36" w:name="objectif-général"/>
+    <w:bookmarkStart w:id="49" w:name="objectif-général"/>
     <w:p>
       <w:pPr>
         <w:pStyle w:val="Heading2"/>
@@ -5395,8 +6393,8 @@
         <w:t xml:space="preserve">des incidents.</w:t>
       </w:r>
     </w:p>
-    <w:bookmarkEnd w:id="36"/>
-    <w:bookmarkStart w:id="37" w:name="objectifs-spécifiques"/>
+    <w:bookmarkEnd w:id="49"/>
+    <w:bookmarkStart w:id="50" w:name="objectifs-spécifiques"/>
     <w:p>
       <w:pPr>
         <w:pStyle w:val="Heading2"/>
@@ -5692,8 +6690,8 @@
         <w:t xml:space="preserve">rapport à la supervision manuelle.</w:t>
       </w:r>
     </w:p>
-    <w:bookmarkEnd w:id="37"/>
-    <w:bookmarkStart w:id="38" w:name="hypothèses-de-recherche"/>
+    <w:bookmarkEnd w:id="50"/>
+    <w:bookmarkStart w:id="51" w:name="hypothèses-de-recherche"/>
     <w:p>
       <w:pPr>
         <w:pStyle w:val="Heading2"/>
@@ -5940,8 +6938,8 @@
         </w:tc>
       </w:tr>
     </w:tbl>
-    <w:bookmarkEnd w:id="38"/>
-    <w:bookmarkStart w:id="39" w:name="résultats-attendus-indicateurs"/>
+    <w:bookmarkEnd w:id="51"/>
+    <w:bookmarkStart w:id="52" w:name="résultats-attendus-indicateurs"/>
     <w:p>
       <w:pPr>
         <w:pStyle w:val="Heading2"/>
@@ -6233,9 +7231,9 @@
         <w:br w:type="page"/>
       </w:r>
     </w:p>
-    <w:bookmarkEnd w:id="39"/>
-    <w:bookmarkEnd w:id="40"/>
-    <w:bookmarkStart w:id="48" w:name="chapitre-3-démarche-méthodologique"/>
+    <w:bookmarkEnd w:id="52"/>
+    <w:bookmarkEnd w:id="53"/>
+    <w:bookmarkStart w:id="61" w:name="chapitre-3-démarche-méthodologique"/>
     <w:p>
       <w:pPr>
         <w:pStyle w:val="Heading1"/>
@@ -6244,7 +7242,7 @@
         <w:t xml:space="preserve">CHAPITRE 3 — DÉMARCHE MÉTHODOLOGIQUE</w:t>
       </w:r>
     </w:p>
-    <w:bookmarkStart w:id="41" w:name="type-de-recherche"/>
+    <w:bookmarkStart w:id="54" w:name="type-de-recherche"/>
     <w:p>
       <w:pPr>
         <w:pStyle w:val="Heading2"/>
@@ -6386,8 +7384,8 @@
         <w:t xml:space="preserve">l’évaluation d’un système répondant à un problème concret.</w:t>
       </w:r>
     </w:p>
-    <w:bookmarkEnd w:id="41"/>
-    <w:bookmarkStart w:id="42" w:name="approche-méthodologique"/>
+    <w:bookmarkEnd w:id="54"/>
+    <w:bookmarkStart w:id="55" w:name="approche-méthodologique"/>
     <w:p>
       <w:pPr>
         <w:pStyle w:val="Heading2"/>
@@ -6543,8 +7541,8 @@
         <w:t xml:space="preserve">qualité.</w:t>
       </w:r>
     </w:p>
-    <w:bookmarkEnd w:id="42"/>
-    <w:bookmarkStart w:id="43" w:name="X1de58a10451cf6d5d46a7714260d12f1bbde2a9"/>
+    <w:bookmarkEnd w:id="55"/>
+    <w:bookmarkStart w:id="56" w:name="X1de58a10451cf6d5d46a7714260d12f1bbde2a9"/>
     <w:p>
       <w:pPr>
         <w:pStyle w:val="Heading2"/>
@@ -6705,8 +7703,8 @@
         <w:t xml:space="preserve">recueillir les temps de détection/réaction de référence.</w:t>
       </w:r>
     </w:p>
-    <w:bookmarkEnd w:id="43"/>
-    <w:bookmarkStart w:id="44" w:name="méthode-danalyse"/>
+    <w:bookmarkEnd w:id="56"/>
+    <w:bookmarkStart w:id="57" w:name="méthode-danalyse"/>
     <w:p>
       <w:pPr>
         <w:pStyle w:val="Heading2"/>
@@ -6877,8 +7875,8 @@
         <w:t xml:space="preserve">données.</w:t>
       </w:r>
     </w:p>
-    <w:bookmarkEnd w:id="44"/>
-    <w:bookmarkStart w:id="45" w:name="outils-techniques-mobilisés"/>
+    <w:bookmarkEnd w:id="57"/>
+    <w:bookmarkStart w:id="58" w:name="outils-techniques-mobilisés"/>
     <w:p>
       <w:pPr>
         <w:pStyle w:val="Heading2"/>
@@ -7283,8 +8281,8 @@
         </w:tc>
       </w:tr>
     </w:tbl>
-    <w:bookmarkEnd w:id="45"/>
-    <w:bookmarkStart w:id="46" w:name="planning-de-réalisation-du-projet"/>
+    <w:bookmarkEnd w:id="58"/>
+    <w:bookmarkStart w:id="59" w:name="planning-de-réalisation-du-projet"/>
     <w:p>
       <w:pPr>
         <w:pStyle w:val="Heading2"/>
@@ -7633,8 +8631,8 @@
         </w:tc>
       </w:tr>
     </w:tbl>
-    <w:bookmarkEnd w:id="46"/>
-    <w:bookmarkStart w:id="47" w:name="délimitation-du-champ-de-létude"/>
+    <w:bookmarkEnd w:id="59"/>
+    <w:bookmarkStart w:id="60" w:name="délimitation-du-champ-de-létude"/>
     <w:p>
       <w:pPr>
         <w:pStyle w:val="Heading2"/>
@@ -7763,9 +8761,9 @@
         <w:br w:type="page"/>
       </w:r>
     </w:p>
-    <w:bookmarkEnd w:id="47"/>
-    <w:bookmarkEnd w:id="48"/>
-    <w:bookmarkStart w:id="60" w:name="X0c8bb5db331a54a45c811700d10be1305ba5e16"/>
+    <w:bookmarkEnd w:id="60"/>
+    <w:bookmarkEnd w:id="61"/>
+    <w:bookmarkStart w:id="73" w:name="X0c8bb5db331a54a45c811700d10be1305ba5e16"/>
     <w:p>
       <w:pPr>
         <w:pStyle w:val="Heading1"/>
@@ -7774,7 +8772,7 @@
         <w:t xml:space="preserve">CHAPITRE 4 — ÉTAT DES LIEUX DES SOLUTIONS EXISTANTES ET SOLUTION PROPOSÉE</w:t>
       </w:r>
     </w:p>
-    <w:bookmarkStart w:id="49" w:name="cadre-conceptuel-et-définitions"/>
+    <w:bookmarkStart w:id="62" w:name="cadre-conceptuel-et-définitions"/>
     <w:p>
       <w:pPr>
         <w:pStyle w:val="Heading2"/>
@@ -8403,8 +9401,8 @@
         <w:t xml:space="preserve">service (ex. taux de disponibilité garanti, délai d’intervention).</w:t>
       </w:r>
     </w:p>
-    <w:bookmarkEnd w:id="49"/>
-    <w:bookmarkStart w:id="50" w:name="la-supervision-manuelle"/>
+    <w:bookmarkEnd w:id="62"/>
+    <w:bookmarkStart w:id="63" w:name="la-supervision-manuelle"/>
     <w:p>
       <w:pPr>
         <w:pStyle w:val="Heading2"/>
@@ -8563,8 +9561,8 @@
         <w:t xml:space="preserve">fonctionnement initial observé sur le terrain, à l’origine du présent projet.</w:t>
       </w:r>
     </w:p>
-    <w:bookmarkEnd w:id="50"/>
-    <w:bookmarkStart w:id="56" w:name="la-supervision-automatisée"/>
+    <w:bookmarkEnd w:id="63"/>
+    <w:bookmarkStart w:id="69" w:name="la-supervision-automatisée"/>
     <w:p>
       <w:pPr>
         <w:pStyle w:val="Heading2"/>
@@ -8651,7 +9649,7 @@
         <w:t xml:space="preserve">. Plusieurs solutions matures existent, présentées ci-après.</w:t>
       </w:r>
     </w:p>
-    <w:bookmarkStart w:id="51" w:name="nagios"/>
+    <w:bookmarkStart w:id="64" w:name="nagios"/>
     <w:p>
       <w:pPr>
         <w:pStyle w:val="Heading3"/>
@@ -8773,8 +9771,8 @@
         <w:t xml:space="preserve">payant.</w:t>
       </w:r>
     </w:p>
-    <w:bookmarkEnd w:id="51"/>
-    <w:bookmarkStart w:id="52" w:name="zabbix"/>
+    <w:bookmarkEnd w:id="64"/>
+    <w:bookmarkStart w:id="65" w:name="zabbix"/>
     <w:p>
       <w:pPr>
         <w:pStyle w:val="Heading3"/>
@@ -8835,8 +9833,8 @@
         <w:t xml:space="preserve">disproportionnée pour de petits besoins. Logiciel gratuit, support payant.</w:t>
       </w:r>
     </w:p>
-    <w:bookmarkEnd w:id="52"/>
-    <w:bookmarkStart w:id="53" w:name="prtg-network-monitor"/>
+    <w:bookmarkEnd w:id="65"/>
+    <w:bookmarkStart w:id="66" w:name="prtg-network-monitor"/>
     <w:p>
       <w:pPr>
         <w:pStyle w:val="Heading3"/>
@@ -8950,8 +9948,8 @@
         <w:t xml:space="preserve">.</w:t>
       </w:r>
     </w:p>
-    <w:bookmarkEnd w:id="53"/>
-    <w:bookmarkStart w:id="54" w:name="centreon"/>
+    <w:bookmarkEnd w:id="66"/>
+    <w:bookmarkStart w:id="67" w:name="centreon"/>
     <w:p>
       <w:pPr>
         <w:pStyle w:val="Heading3"/>
@@ -9003,8 +10001,8 @@
         <w:t xml:space="preserve">.</w:t>
       </w:r>
     </w:p>
-    <w:bookmarkEnd w:id="54"/>
-    <w:bookmarkStart w:id="55" w:name="solarwinds-npm"/>
+    <w:bookmarkEnd w:id="67"/>
+    <w:bookmarkStart w:id="68" w:name="solarwinds-npm"/>
     <w:p>
       <w:pPr>
         <w:pStyle w:val="Heading3"/>
@@ -9087,9 +10085,9 @@
         <w:t xml:space="preserve">(plusieurs millions de FCFA).</w:t>
       </w:r>
     </w:p>
-    <w:bookmarkEnd w:id="55"/>
-    <w:bookmarkEnd w:id="56"/>
-    <w:bookmarkStart w:id="57" w:name="tableau-comparatif-des-solutions"/>
+    <w:bookmarkEnd w:id="68"/>
+    <w:bookmarkEnd w:id="69"/>
+    <w:bookmarkStart w:id="70" w:name="tableau-comparatif-des-solutions"/>
     <w:p>
       <w:pPr>
         <w:pStyle w:val="Heading2"/>
@@ -10198,8 +11196,8 @@
         </w:tc>
       </w:tr>
     </w:tbl>
-    <w:bookmarkEnd w:id="57"/>
-    <w:bookmarkStart w:id="58" w:name="synthèse-le-vide-à-combler"/>
+    <w:bookmarkEnd w:id="70"/>
+    <w:bookmarkStart w:id="71" w:name="synthèse-le-vide-à-combler"/>
     <w:p>
       <w:pPr>
         <w:pStyle w:val="Heading2"/>
@@ -10338,8 +11336,8 @@
         <w:t xml:space="preserve">plutôt que l’adoption d’un outil existant.</w:t>
       </w:r>
     </w:p>
-    <w:bookmarkEnd w:id="58"/>
-    <w:bookmarkStart w:id="59" w:name="la-solution-proposée"/>
+    <w:bookmarkEnd w:id="71"/>
+    <w:bookmarkStart w:id="72" w:name="la-solution-proposée"/>
     <w:p>
       <w:pPr>
         <w:pStyle w:val="Heading2"/>
@@ -10672,9 +11670,9 @@
         <w:br w:type="page"/>
       </w:r>
     </w:p>
-    <w:bookmarkEnd w:id="59"/>
-    <w:bookmarkEnd w:id="60"/>
-    <w:bookmarkStart w:id="65" w:name="Xe8dfcfb22a90816379ee368629a1d2dadc588e9"/>
+    <w:bookmarkEnd w:id="72"/>
+    <w:bookmarkEnd w:id="73"/>
+    <w:bookmarkStart w:id="78" w:name="Xe8dfcfb22a90816379ee368629a1d2dadc588e9"/>
     <w:p>
       <w:pPr>
         <w:pStyle w:val="Heading1"/>
@@ -10683,7 +11681,7 @@
         <w:t xml:space="preserve">CHAPITRE 5 — L’AXE DE DIFFÉRENCIATION (INNOVATION TECHNOLOGIQUE)</w:t>
       </w:r>
     </w:p>
-    <w:bookmarkStart w:id="61" w:name="une-innovation-par-lassemblage"/>
+    <w:bookmarkStart w:id="74" w:name="une-innovation-par-lassemblage"/>
     <w:p>
       <w:pPr>
         <w:pStyle w:val="Heading2"/>
@@ -10794,8 +11792,8 @@
         <w:t xml:space="preserve">gratuité, légèreté, notification mobile native et ouverture vers l’IA.</w:t>
       </w:r>
     </w:p>
-    <w:bookmarkEnd w:id="61"/>
-    <w:bookmarkStart w:id="62" w:name="les-facteurs-de-différenciation"/>
+    <w:bookmarkEnd w:id="74"/>
+    <w:bookmarkStart w:id="75" w:name="les-facteurs-de-différenciation"/>
     <w:p>
       <w:pPr>
         <w:pStyle w:val="Heading2"/>
@@ -11061,8 +12059,8 @@
         </w:tc>
       </w:tr>
     </w:tbl>
-    <w:bookmarkEnd w:id="62"/>
-    <w:bookmarkStart w:id="63" w:name="Xb9b8bca5adcba468a55b36e4a7c0711b407952a"/>
+    <w:bookmarkEnd w:id="75"/>
+    <w:bookmarkStart w:id="76" w:name="Xb9b8bca5adcba468a55b36e4a7c0711b407952a"/>
     <w:p>
       <w:pPr>
         <w:pStyle w:val="Heading2"/>
@@ -11183,8 +12181,8 @@
         <w:t xml:space="preserve">direct.</w:t>
       </w:r>
     </w:p>
-    <w:bookmarkEnd w:id="63"/>
-    <w:bookmarkStart w:id="64" w:name="un-socle-évolutif"/>
+    <w:bookmarkEnd w:id="76"/>
+    <w:bookmarkStart w:id="77" w:name="un-socle-évolutif"/>
     <w:p>
       <w:pPr>
         <w:pStyle w:val="Heading2"/>
@@ -11346,9 +12344,9 @@
         <w:br w:type="page"/>
       </w:r>
     </w:p>
-    <w:bookmarkEnd w:id="64"/>
-    <w:bookmarkEnd w:id="65"/>
-    <w:bookmarkStart w:id="117" w:name="Xbe564b8d0b5ec43334968bac536dce0e254f7d3"/>
+    <w:bookmarkEnd w:id="77"/>
+    <w:bookmarkEnd w:id="78"/>
+    <w:bookmarkStart w:id="130" w:name="Xbe564b8d0b5ec43334968bac536dce0e254f7d3"/>
     <w:p>
       <w:pPr>
         <w:pStyle w:val="Heading1"/>
@@ -11357,7 +12355,7 @@
         <w:t xml:space="preserve">CHAPITRE 6 — ÉTUDE DE FAISABILITÉ ET CONCEPTION DE LA SOLUTION</w:t>
       </w:r>
     </w:p>
-    <w:bookmarkStart w:id="69" w:name="étude-de-faisabilité"/>
+    <w:bookmarkStart w:id="82" w:name="étude-de-faisabilité"/>
     <w:p>
       <w:pPr>
         <w:pStyle w:val="Heading2"/>
@@ -11366,7 +12364,7 @@
         <w:t xml:space="preserve">6.1 Étude de faisabilité</w:t>
       </w:r>
     </w:p>
-    <w:bookmarkStart w:id="66" w:name="faisabilité-technique"/>
+    <w:bookmarkStart w:id="79" w:name="faisabilité-technique"/>
     <w:p>
       <w:pPr>
         <w:pStyle w:val="Heading3"/>
@@ -11457,8 +12455,8 @@
         <w:t xml:space="preserve">(chapitres 7 et 8).</w:t>
       </w:r>
     </w:p>
-    <w:bookmarkEnd w:id="66"/>
-    <w:bookmarkStart w:id="67" w:name="faisabilité-économique"/>
+    <w:bookmarkEnd w:id="79"/>
+    <w:bookmarkStart w:id="80" w:name="faisabilité-économique"/>
     <w:p>
       <w:pPr>
         <w:pStyle w:val="Heading3"/>
@@ -11545,8 +12543,8 @@
         <w:t xml:space="preserve">(détail au chapitre 10).</w:t>
       </w:r>
     </w:p>
-    <w:bookmarkEnd w:id="67"/>
-    <w:bookmarkStart w:id="68" w:name="faisabilité-organisationnelle"/>
+    <w:bookmarkEnd w:id="80"/>
+    <w:bookmarkStart w:id="81" w:name="faisabilité-organisationnelle"/>
     <w:p>
       <w:pPr>
         <w:pStyle w:val="Heading3"/>
@@ -11625,9 +12623,9 @@
         <w:t xml:space="preserve">organisationnel.</w:t>
       </w:r>
     </w:p>
-    <w:bookmarkEnd w:id="68"/>
-    <w:bookmarkEnd w:id="69"/>
-    <w:bookmarkStart w:id="72" w:name="spécification-des-besoins"/>
+    <w:bookmarkEnd w:id="81"/>
+    <w:bookmarkEnd w:id="82"/>
+    <w:bookmarkStart w:id="85" w:name="spécification-des-besoins"/>
     <w:p>
       <w:pPr>
         <w:pStyle w:val="Heading2"/>
@@ -11636,7 +12634,7 @@
         <w:t xml:space="preserve">6.2 Spécification des besoins</w:t>
       </w:r>
     </w:p>
-    <w:bookmarkStart w:id="70" w:name="besoins-fonctionnels"/>
+    <w:bookmarkStart w:id="83" w:name="besoins-fonctionnels"/>
     <w:p>
       <w:pPr>
         <w:pStyle w:val="Heading3"/>
@@ -11855,8 +12853,8 @@
         <w:t xml:space="preserve">— authentifier les utilisateurs du tableau de bord.</w:t>
       </w:r>
     </w:p>
-    <w:bookmarkEnd w:id="70"/>
-    <w:bookmarkStart w:id="71" w:name="besoins-non-fonctionnels"/>
+    <w:bookmarkEnd w:id="83"/>
+    <w:bookmarkStart w:id="84" w:name="besoins-non-fonctionnels"/>
     <w:p>
       <w:pPr>
         <w:pStyle w:val="Heading3"/>
@@ -12015,9 +13013,9 @@
         <w:t xml:space="preserve">: interface web responsive et intuitive.</w:t>
       </w:r>
     </w:p>
-    <w:bookmarkEnd w:id="71"/>
-    <w:bookmarkEnd w:id="72"/>
-    <w:bookmarkStart w:id="77" w:name="architecture-technique-en-cinq-couches"/>
+    <w:bookmarkEnd w:id="84"/>
+    <w:bookmarkEnd w:id="85"/>
+    <w:bookmarkStart w:id="90" w:name="architecture-technique-en-cinq-couches"/>
     <w:p>
       <w:pPr>
         <w:pStyle w:val="Heading2"/>
@@ -12065,18 +13063,18 @@
           <wp:inline>
             <wp:extent cx="5334000" cy="3019443"/>
             <wp:effectExtent b="0" l="0" r="0" t="0"/>
-            <wp:docPr descr="Figure 1 — Architecture en cinq couches du système de supervision" title="" id="74" name="Picture"/>
+            <wp:docPr descr="Figure 1 — Architecture en cinq couches du système de supervision" title="" id="87" name="Picture"/>
             <a:graphic>
               <a:graphicData uri="http://schemas.openxmlformats.org/drawingml/2006/picture">
                 <pic:pic>
                   <pic:nvPicPr>
-                    <pic:cNvPr descr="../architecture/architecture-5couches.png" id="75" name="Picture"/>
+                    <pic:cNvPr descr="../architecture/architecture-5couches.png" id="88" name="Picture"/>
                     <pic:cNvPicPr>
                       <a:picLocks noChangeArrowheads="1" noChangeAspect="1"/>
                     </pic:cNvPicPr>
                   </pic:nvPicPr>
                   <pic:blipFill>
-                    <a:blip r:embed="rId73"/>
+                    <a:blip r:embed="rId86"/>
                     <a:stretch>
                       <a:fillRect/>
                     </a:stretch>
@@ -12219,7 +13217,7 @@
         <w:t xml:space="preserve">donc même si le tableau de bord est arrêté, ce qui renforce la robustesse.</w:t>
       </w:r>
     </w:p>
-    <w:bookmarkStart w:id="76" w:name="justification-des-choix-technologiques"/>
+    <w:bookmarkStart w:id="89" w:name="justification-des-choix-technologiques"/>
     <w:p>
       <w:pPr>
         <w:pStyle w:val="Heading3"/>
@@ -12586,9 +13584,9 @@
         </w:tc>
       </w:tr>
     </w:tbl>
-    <w:bookmarkEnd w:id="76"/>
-    <w:bookmarkEnd w:id="77"/>
-    <w:bookmarkStart w:id="106" w:name="conception-uml"/>
+    <w:bookmarkEnd w:id="89"/>
+    <w:bookmarkEnd w:id="90"/>
+    <w:bookmarkStart w:id="119" w:name="conception-uml"/>
     <w:p>
       <w:pPr>
         <w:pStyle w:val="Heading2"/>
@@ -12624,7 +13622,7 @@
         <w:t xml:space="preserve">abstrait (contexte) au plus concret (déploiement).</w:t>
       </w:r>
     </w:p>
-    <w:bookmarkStart w:id="81" w:name="diagramme-de-contexte"/>
+    <w:bookmarkStart w:id="94" w:name="diagramme-de-contexte"/>
     <w:p>
       <w:pPr>
         <w:pStyle w:val="Heading3"/>
@@ -12717,18 +13715,18 @@
           <wp:inline>
             <wp:extent cx="5334000" cy="1905379"/>
             <wp:effectExtent b="0" l="0" r="0" t="0"/>
-            <wp:docPr descr="Figure 2 — Diagramme de contexte" title="" id="79" name="Picture"/>
+            <wp:docPr descr="Figure 2 — Diagramme de contexte" title="" id="92" name="Picture"/>
             <a:graphic>
               <a:graphicData uri="http://schemas.openxmlformats.org/drawingml/2006/picture">
                 <pic:pic>
                   <pic:nvPicPr>
-                    <pic:cNvPr descr="../architecture/diagrammes/diagramme-contexte.png" id="80" name="Picture"/>
+                    <pic:cNvPr descr="../architecture/diagrammes/diagramme-contexte.png" id="93" name="Picture"/>
                     <pic:cNvPicPr>
                       <a:picLocks noChangeArrowheads="1" noChangeAspect="1"/>
                     </pic:cNvPicPr>
                   </pic:nvPicPr>
                   <pic:blipFill>
-                    <a:blip r:embed="rId78"/>
+                    <a:blip r:embed="rId91"/>
                     <a:stretch>
                       <a:fillRect/>
                     </a:stretch>
@@ -12763,8 +13761,8 @@
         <w:t xml:space="preserve">Figure 2 — Diagramme de contexte</w:t>
       </w:r>
     </w:p>
-    <w:bookmarkEnd w:id="81"/>
-    <w:bookmarkStart w:id="85" w:name="diagramme-de-cas-dutilisation"/>
+    <w:bookmarkEnd w:id="94"/>
+    <w:bookmarkStart w:id="98" w:name="diagramme-de-cas-dutilisation"/>
     <w:p>
       <w:pPr>
         <w:pStyle w:val="Heading3"/>
@@ -12840,18 +13838,18 @@
           <wp:inline>
             <wp:extent cx="5334000" cy="2071803"/>
             <wp:effectExtent b="0" l="0" r="0" t="0"/>
-            <wp:docPr descr="Figure 3 — Diagramme de cas d’utilisation" title="" id="83" name="Picture"/>
+            <wp:docPr descr="Figure 3 — Diagramme de cas d’utilisation" title="" id="96" name="Picture"/>
             <a:graphic>
               <a:graphicData uri="http://schemas.openxmlformats.org/drawingml/2006/picture">
                 <pic:pic>
                   <pic:nvPicPr>
-                    <pic:cNvPr descr="../architecture/diagrammes/cas-utilisation.png" id="84" name="Picture"/>
+                    <pic:cNvPr descr="../architecture/diagrammes/cas-utilisation.png" id="97" name="Picture"/>
                     <pic:cNvPicPr>
                       <a:picLocks noChangeArrowheads="1" noChangeAspect="1"/>
                     </pic:cNvPicPr>
                   </pic:nvPicPr>
                   <pic:blipFill>
-                    <a:blip r:embed="rId82"/>
+                    <a:blip r:embed="rId95"/>
                     <a:stretch>
                       <a:fillRect/>
                     </a:stretch>
@@ -12886,8 +13884,8 @@
         <w:t xml:space="preserve">Figure 3 — Diagramme de cas d’utilisation</w:t>
       </w:r>
     </w:p>
-    <w:bookmarkEnd w:id="85"/>
-    <w:bookmarkStart w:id="89" w:name="diagramme-de-séquence"/>
+    <w:bookmarkEnd w:id="98"/>
+    <w:bookmarkStart w:id="102" w:name="diagramme-de-séquence"/>
     <w:p>
       <w:pPr>
         <w:pStyle w:val="Heading3"/>
@@ -12947,18 +13945,18 @@
           <wp:inline>
             <wp:extent cx="5334000" cy="4179258"/>
             <wp:effectExtent b="0" l="0" r="0" t="0"/>
-            <wp:docPr descr="Figure 4 — Diagramme de séquence" title="" id="87" name="Picture"/>
+            <wp:docPr descr="Figure 4 — Diagramme de séquence" title="" id="100" name="Picture"/>
             <a:graphic>
               <a:graphicData uri="http://schemas.openxmlformats.org/drawingml/2006/picture">
                 <pic:pic>
                   <pic:nvPicPr>
-                    <pic:cNvPr descr="../architecture/diagrammes/diagramme-sequence.png" id="88" name="Picture"/>
+                    <pic:cNvPr descr="../architecture/diagrammes/diagramme-sequence.png" id="101" name="Picture"/>
                     <pic:cNvPicPr>
                       <a:picLocks noChangeArrowheads="1" noChangeAspect="1"/>
                     </pic:cNvPicPr>
                   </pic:nvPicPr>
                   <pic:blipFill>
-                    <a:blip r:embed="rId86"/>
+                    <a:blip r:embed="rId99"/>
                     <a:stretch>
                       <a:fillRect/>
                     </a:stretch>
@@ -12993,8 +13991,8 @@
         <w:t xml:space="preserve">Figure 4 — Diagramme de séquence</w:t>
       </w:r>
     </w:p>
-    <w:bookmarkEnd w:id="89"/>
-    <w:bookmarkStart w:id="93" w:name="diagramme-dactivité"/>
+    <w:bookmarkEnd w:id="102"/>
+    <w:bookmarkStart w:id="106" w:name="diagramme-dactivité"/>
     <w:p>
       <w:pPr>
         <w:pStyle w:val="Heading3"/>
@@ -13032,18 +14030,18 @@
           <wp:inline>
             <wp:extent cx="5334000" cy="8524751"/>
             <wp:effectExtent b="0" l="0" r="0" t="0"/>
-            <wp:docPr descr="Figure 5 — Diagramme d’activité" title="" id="91" name="Picture"/>
+            <wp:docPr descr="Figure 5 — Diagramme d’activité" title="" id="104" name="Picture"/>
             <a:graphic>
               <a:graphicData uri="http://schemas.openxmlformats.org/drawingml/2006/picture">
                 <pic:pic>
                   <pic:nvPicPr>
-                    <pic:cNvPr descr="../architecture/diagrammes/diagramme-activite.png" id="92" name="Picture"/>
+                    <pic:cNvPr descr="../architecture/diagrammes/diagramme-activite.png" id="105" name="Picture"/>
                     <pic:cNvPicPr>
                       <a:picLocks noChangeArrowheads="1" noChangeAspect="1"/>
                     </pic:cNvPicPr>
                   </pic:nvPicPr>
                   <pic:blipFill>
-                    <a:blip r:embed="rId90"/>
+                    <a:blip r:embed="rId103"/>
                     <a:stretch>
                       <a:fillRect/>
                     </a:stretch>
@@ -13078,8 +14076,8 @@
         <w:t xml:space="preserve">Figure 5 — Diagramme d’activité</w:t>
       </w:r>
     </w:p>
-    <w:bookmarkEnd w:id="93"/>
-    <w:bookmarkStart w:id="97" w:name="diagramme-de-classes"/>
+    <w:bookmarkEnd w:id="106"/>
+    <w:bookmarkStart w:id="110" w:name="diagramme-de-classes"/>
     <w:p>
       <w:pPr>
         <w:pStyle w:val="Heading3"/>
@@ -13314,18 +14312,18 @@
           <wp:inline>
             <wp:extent cx="5334000" cy="2266572"/>
             <wp:effectExtent b="0" l="0" r="0" t="0"/>
-            <wp:docPr descr="Figure 6 — Diagramme de classes" title="" id="95" name="Picture"/>
+            <wp:docPr descr="Figure 6 — Diagramme de classes" title="" id="108" name="Picture"/>
             <a:graphic>
               <a:graphicData uri="http://schemas.openxmlformats.org/drawingml/2006/picture">
                 <pic:pic>
                   <pic:nvPicPr>
-                    <pic:cNvPr descr="../architecture/diagrammes/diagramme-classes.png" id="96" name="Picture"/>
+                    <pic:cNvPr descr="../architecture/diagrammes/diagramme-classes.png" id="109" name="Picture"/>
                     <pic:cNvPicPr>
                       <a:picLocks noChangeArrowheads="1" noChangeAspect="1"/>
                     </pic:cNvPicPr>
                   </pic:nvPicPr>
                   <pic:blipFill>
-                    <a:blip r:embed="rId94"/>
+                    <a:blip r:embed="rId107"/>
                     <a:stretch>
                       <a:fillRect/>
                     </a:stretch>
@@ -13360,8 +14358,8 @@
         <w:t xml:space="preserve">Figure 6 — Diagramme de classes</w:t>
       </w:r>
     </w:p>
-    <w:bookmarkEnd w:id="97"/>
-    <w:bookmarkStart w:id="101" w:name="diagramme-de-composants"/>
+    <w:bookmarkEnd w:id="110"/>
+    <w:bookmarkStart w:id="114" w:name="diagramme-de-composants"/>
     <w:p>
       <w:pPr>
         <w:pStyle w:val="Heading3"/>
@@ -13399,18 +14397,18 @@
           <wp:inline>
             <wp:extent cx="5334000" cy="3074068"/>
             <wp:effectExtent b="0" l="0" r="0" t="0"/>
-            <wp:docPr descr="Figure 7 — Diagramme de composants" title="" id="99" name="Picture"/>
+            <wp:docPr descr="Figure 7 — Diagramme de composants" title="" id="112" name="Picture"/>
             <a:graphic>
               <a:graphicData uri="http://schemas.openxmlformats.org/drawingml/2006/picture">
                 <pic:pic>
                   <pic:nvPicPr>
-                    <pic:cNvPr descr="../architecture/diagrammes/diagramme-composants.png" id="100" name="Picture"/>
+                    <pic:cNvPr descr="../architecture/diagrammes/diagramme-composants.png" id="113" name="Picture"/>
                     <pic:cNvPicPr>
                       <a:picLocks noChangeArrowheads="1" noChangeAspect="1"/>
                     </pic:cNvPicPr>
                   </pic:nvPicPr>
                   <pic:blipFill>
-                    <a:blip r:embed="rId98"/>
+                    <a:blip r:embed="rId111"/>
                     <a:stretch>
                       <a:fillRect/>
                     </a:stretch>
@@ -13445,8 +14443,8 @@
         <w:t xml:space="preserve">Figure 7 — Diagramme de composants</w:t>
       </w:r>
     </w:p>
-    <w:bookmarkEnd w:id="101"/>
-    <w:bookmarkStart w:id="105" w:name="diagramme-de-déploiement"/>
+    <w:bookmarkEnd w:id="114"/>
+    <w:bookmarkStart w:id="118" w:name="diagramme-de-déploiement"/>
     <w:p>
       <w:pPr>
         <w:pStyle w:val="Heading3"/>
@@ -13484,18 +14482,18 @@
           <wp:inline>
             <wp:extent cx="5334000" cy="2316673"/>
             <wp:effectExtent b="0" l="0" r="0" t="0"/>
-            <wp:docPr descr="Figure 8 — Diagramme de déploiement" title="" id="103" name="Picture"/>
+            <wp:docPr descr="Figure 8 — Diagramme de déploiement" title="" id="116" name="Picture"/>
             <a:graphic>
               <a:graphicData uri="http://schemas.openxmlformats.org/drawingml/2006/picture">
                 <pic:pic>
                   <pic:nvPicPr>
-                    <pic:cNvPr descr="../architecture/diagrammes/diagramme-deploiement.png" id="104" name="Picture"/>
+                    <pic:cNvPr descr="../architecture/diagrammes/diagramme-deploiement.png" id="117" name="Picture"/>
                     <pic:cNvPicPr>
                       <a:picLocks noChangeArrowheads="1" noChangeAspect="1"/>
                     </pic:cNvPicPr>
                   </pic:nvPicPr>
                   <pic:blipFill>
-                    <a:blip r:embed="rId102"/>
+                    <a:blip r:embed="rId115"/>
                     <a:stretch>
                       <a:fillRect/>
                     </a:stretch>
@@ -13530,9 +14528,9 @@
         <w:t xml:space="preserve">Figure 8 — Diagramme de déploiement</w:t>
       </w:r>
     </w:p>
-    <w:bookmarkEnd w:id="105"/>
-    <w:bookmarkEnd w:id="106"/>
-    <w:bookmarkStart w:id="116" w:name="X8644302284a05d968005979466b25083f043850"/>
+    <w:bookmarkEnd w:id="118"/>
+    <w:bookmarkEnd w:id="119"/>
+    <w:bookmarkStart w:id="129" w:name="X8644302284a05d968005979466b25083f043850"/>
     <w:p>
       <w:pPr>
         <w:pStyle w:val="Heading2"/>
@@ -13614,7 +14612,7 @@
         <w:t xml:space="preserve">(script SQL).</w:t>
       </w:r>
     </w:p>
-    <w:bookmarkStart w:id="110" w:name="modèle-conceptuel-de-données-mcd"/>
+    <w:bookmarkStart w:id="123" w:name="modèle-conceptuel-de-données-mcd"/>
     <w:p>
       <w:pPr>
         <w:pStyle w:val="Heading3"/>
@@ -13810,18 +14808,18 @@
           <wp:inline>
             <wp:extent cx="5207000" cy="6388100"/>
             <wp:effectExtent b="0" l="0" r="0" t="0"/>
-            <wp:docPr descr="Figure 9 — Modèle Conceptuel de Données (MCD)" title="" id="108" name="Picture"/>
+            <wp:docPr descr="Figure 9 — Modèle Conceptuel de Données (MCD)" title="" id="121" name="Picture"/>
             <a:graphic>
               <a:graphicData uri="http://schemas.openxmlformats.org/drawingml/2006/picture">
                 <pic:pic>
                   <pic:nvPicPr>
-                    <pic:cNvPr descr="../database/mcd.png" id="109" name="Picture"/>
+                    <pic:cNvPr descr="../database/mcd.png" id="122" name="Picture"/>
                     <pic:cNvPicPr>
                       <a:picLocks noChangeArrowheads="1" noChangeAspect="1"/>
                     </pic:cNvPicPr>
                   </pic:nvPicPr>
                   <pic:blipFill>
-                    <a:blip r:embed="rId107"/>
+                    <a:blip r:embed="rId120"/>
                     <a:stretch>
                       <a:fillRect/>
                     </a:stretch>
@@ -13856,8 +14854,8 @@
         <w:t xml:space="preserve">Figure 9 — Modèle Conceptuel de Données (MCD)</w:t>
       </w:r>
     </w:p>
-    <w:bookmarkEnd w:id="110"/>
-    <w:bookmarkStart w:id="114" w:name="modèle-logique-de-données-mld"/>
+    <w:bookmarkEnd w:id="123"/>
+    <w:bookmarkStart w:id="127" w:name="modèle-logique-de-données-mld"/>
     <w:p>
       <w:pPr>
         <w:pStyle w:val="Heading3"/>
@@ -14058,18 +15056,18 @@
           <wp:inline>
             <wp:extent cx="5334000" cy="3398841"/>
             <wp:effectExtent b="0" l="0" r="0" t="0"/>
-            <wp:docPr descr="Figure 10 — Modèle Logique de Données (MLD)" title="" id="112" name="Picture"/>
+            <wp:docPr descr="Figure 10 — Modèle Logique de Données (MLD)" title="" id="125" name="Picture"/>
             <a:graphic>
               <a:graphicData uri="http://schemas.openxmlformats.org/drawingml/2006/picture">
                 <pic:pic>
                   <pic:nvPicPr>
-                    <pic:cNvPr descr="../database/mld.png" id="113" name="Picture"/>
+                    <pic:cNvPr descr="../database/mld.png" id="126" name="Picture"/>
                     <pic:cNvPicPr>
                       <a:picLocks noChangeArrowheads="1" noChangeAspect="1"/>
                     </pic:cNvPicPr>
                   </pic:nvPicPr>
                   <pic:blipFill>
-                    <a:blip r:embed="rId111"/>
+                    <a:blip r:embed="rId124"/>
                     <a:stretch>
                       <a:fillRect/>
                     </a:stretch>
@@ -14104,8 +15102,8 @@
         <w:t xml:space="preserve">Figure 10 — Modèle Logique de Données (MLD)</w:t>
       </w:r>
     </w:p>
-    <w:bookmarkEnd w:id="114"/>
-    <w:bookmarkStart w:id="115" w:name="choix-physiques"/>
+    <w:bookmarkEnd w:id="127"/>
+    <w:bookmarkStart w:id="128" w:name="choix-physiques"/>
     <w:p>
       <w:pPr>
         <w:pStyle w:val="Heading3"/>
@@ -14240,10 +15238,10 @@
         <w:br w:type="page"/>
       </w:r>
     </w:p>
-    <w:bookmarkEnd w:id="115"/>
-    <w:bookmarkEnd w:id="116"/>
-    <w:bookmarkEnd w:id="117"/>
-    <w:bookmarkStart w:id="132" w:name="X9956e667ec3f93c81e5275e908ed1116122b364"/>
+    <w:bookmarkEnd w:id="128"/>
+    <w:bookmarkEnd w:id="129"/>
+    <w:bookmarkEnd w:id="130"/>
+    <w:bookmarkStart w:id="145" w:name="X9956e667ec3f93c81e5275e908ed1116122b364"/>
     <w:p>
       <w:pPr>
         <w:pStyle w:val="Heading1"/>
@@ -14272,7 +15270,7 @@
         <w:t xml:space="preserve">présentés ci-dessous.</w:t>
       </w:r>
     </w:p>
-    <w:bookmarkStart w:id="118" w:name="arborescence-du-projet"/>
+    <w:bookmarkStart w:id="131" w:name="arborescence-du-projet"/>
     <w:p>
       <w:pPr>
         <w:pStyle w:val="Heading2"/>
@@ -14454,8 +15452,8 @@
         <w:t xml:space="preserve">└── tests/               # Tests unitaires et fonctionnels</w:t>
       </w:r>
     </w:p>
-    <w:bookmarkEnd w:id="118"/>
-    <w:bookmarkStart w:id="119" w:name="Xfe3100079f6d61d20b27168ee9c9618de3b14f5"/>
+    <w:bookmarkEnd w:id="131"/>
+    <w:bookmarkStart w:id="132" w:name="Xfe3100079f6d61d20b27168ee9c9618de3b14f5"/>
     <w:p>
       <w:pPr>
         <w:pStyle w:val="Heading2"/>
@@ -15483,8 +16481,8 @@
         <w:t xml:space="preserve">0 3 * * *   cd /opt/supervision/src &amp;&amp; python supervisor.py --decouvrir 192.168.1.0/24</w:t>
       </w:r>
     </w:p>
-    <w:bookmarkEnd w:id="119"/>
-    <w:bookmarkStart w:id="120" w:name="X0acc256748dc9b1e30c92f39b37db48f459e641"/>
+    <w:bookmarkEnd w:id="132"/>
+    <w:bookmarkStart w:id="133" w:name="X0acc256748dc9b1e30c92f39b37db48f459e641"/>
     <w:p>
       <w:pPr>
         <w:pStyle w:val="Heading2"/>
@@ -15764,8 +16762,8 @@
         <w:t xml:space="preserve">            actifs.append(resultat)</w:t>
       </w:r>
     </w:p>
-    <w:bookmarkEnd w:id="120"/>
-    <w:bookmarkStart w:id="123" w:name="les-sondes-de-disponibilité"/>
+    <w:bookmarkEnd w:id="133"/>
+    <w:bookmarkStart w:id="136" w:name="les-sondes-de-disponibilité"/>
     <w:p>
       <w:pPr>
         <w:pStyle w:val="Heading2"/>
@@ -15774,7 +16772,7 @@
         <w:t xml:space="preserve">7.4 Les sondes de disponibilité</w:t>
       </w:r>
     </w:p>
-    <w:bookmarkStart w:id="121" w:name="sonde-icmp-ping"/>
+    <w:bookmarkStart w:id="134" w:name="sonde-icmp-ping"/>
     <w:p>
       <w:pPr>
         <w:pStyle w:val="Heading3"/>
@@ -16152,8 +17150,8 @@
         <w:t xml:space="preserve">None</w:t>
       </w:r>
     </w:p>
-    <w:bookmarkEnd w:id="121"/>
-    <w:bookmarkStart w:id="122" w:name="sonde-de-service-tcp"/>
+    <w:bookmarkEnd w:id="134"/>
+    <w:bookmarkStart w:id="135" w:name="sonde-de-service-tcp"/>
     <w:p>
       <w:pPr>
         <w:pStyle w:val="Heading3"/>
@@ -16208,9 +17206,9 @@
         <w:t xml:space="preserve">répond au ping tout en ayant son service applicatif hors d’usage.</w:t>
       </w:r>
     </w:p>
-    <w:bookmarkEnd w:id="122"/>
-    <w:bookmarkEnd w:id="123"/>
-    <w:bookmarkStart w:id="124" w:name="la-gestion-des-alertes-multi-canal"/>
+    <w:bookmarkEnd w:id="135"/>
+    <w:bookmarkEnd w:id="136"/>
+    <w:bookmarkStart w:id="137" w:name="la-gestion-des-alertes-multi-canal"/>
     <w:p>
       <w:pPr>
         <w:pStyle w:val="Heading2"/>
@@ -16519,8 +17517,8 @@
         <w:t xml:space="preserve">instantanée, levier central de la réduction du temps de réaction.</w:t>
       </w:r>
     </w:p>
-    <w:bookmarkEnd w:id="124"/>
-    <w:bookmarkStart w:id="125" w:name="le-tableau-de-bord-web-flask"/>
+    <w:bookmarkEnd w:id="137"/>
+    <w:bookmarkStart w:id="138" w:name="le-tableau-de-bord-web-flask"/>
     <w:p>
       <w:pPr>
         <w:pStyle w:val="Heading2"/>
@@ -16703,8 +17701,8 @@
         <w:t xml:space="preserve">réactive.</w:t>
       </w:r>
     </w:p>
-    <w:bookmarkEnd w:id="125"/>
-    <w:bookmarkStart w:id="126" w:name="sécurité-by-design"/>
+    <w:bookmarkEnd w:id="138"/>
+    <w:bookmarkStart w:id="139" w:name="sécurité-by-design"/>
     <w:p>
       <w:pPr>
         <w:pStyle w:val="Heading2"/>
@@ -17008,8 +18006,8 @@
         </w:tc>
       </w:tr>
     </w:tbl>
-    <w:bookmarkEnd w:id="126"/>
-    <w:bookmarkStart w:id="127" w:name="tests-et-validation"/>
+    <w:bookmarkEnd w:id="139"/>
+    <w:bookmarkStart w:id="140" w:name="tests-et-validation"/>
     <w:p>
       <w:pPr>
         <w:pStyle w:val="Heading2"/>
@@ -17316,8 +18314,8 @@
         <w:t xml:space="preserve">validant le besoin de performance (BNF1).</w:t>
       </w:r>
     </w:p>
-    <w:bookmarkEnd w:id="127"/>
-    <w:bookmarkStart w:id="128" w:name="X0cac37ed81800cb51b84370cd526b4107c490af"/>
+    <w:bookmarkEnd w:id="140"/>
+    <w:bookmarkStart w:id="141" w:name="X0cac37ed81800cb51b84370cd526b4107c490af"/>
     <w:p>
       <w:pPr>
         <w:pStyle w:val="Heading2"/>
@@ -17449,8 +18447,8 @@
         <w:t xml:space="preserve">, seuil d’échecs).</w:t>
       </w:r>
     </w:p>
-    <w:bookmarkEnd w:id="128"/>
-    <w:bookmarkStart w:id="129" w:name="la-couche-daccès-aux-données-dal"/>
+    <w:bookmarkEnd w:id="141"/>
+    <w:bookmarkStart w:id="142" w:name="la-couche-daccès-aux-données-dal"/>
     <w:p>
       <w:pPr>
         <w:pStyle w:val="Heading2"/>
@@ -17596,8 +18594,8 @@
         <w:t xml:space="preserve">fermeture systématique des connexions, même en cas d’exception.</w:t>
       </w:r>
     </w:p>
-    <w:bookmarkEnd w:id="129"/>
-    <w:bookmarkStart w:id="130" w:name="X1c2ab9185aeb7e1b4871b191eb2d1b16c93754d"/>
+    <w:bookmarkEnd w:id="142"/>
+    <w:bookmarkStart w:id="143" w:name="X1c2ab9185aeb7e1b4871b191eb2d1b16c93754d"/>
     <w:p>
       <w:pPr>
         <w:pStyle w:val="Heading2"/>
@@ -18089,8 +19087,8 @@
         <w:t xml:space="preserve">automatiquement ses journaux et alertes.</w:t>
       </w:r>
     </w:p>
-    <w:bookmarkEnd w:id="130"/>
-    <w:bookmarkStart w:id="131" w:name="la-journalisation-applicative"/>
+    <w:bookmarkEnd w:id="143"/>
+    <w:bookmarkStart w:id="144" w:name="la-journalisation-applicative"/>
     <w:p>
       <w:pPr>
         <w:pStyle w:val="Heading2"/>
@@ -18177,9 +19175,9 @@
         <w:br w:type="page"/>
       </w:r>
     </w:p>
-    <w:bookmarkEnd w:id="131"/>
-    <w:bookmarkEnd w:id="132"/>
-    <w:bookmarkStart w:id="158" w:name="Xa42a75fe599b82e8151160d564170687d0c2dcf"/>
+    <w:bookmarkEnd w:id="144"/>
+    <w:bookmarkEnd w:id="145"/>
+    <w:bookmarkStart w:id="171" w:name="Xa42a75fe599b82e8151160d564170687d0c2dcf"/>
     <w:p>
       <w:pPr>
         <w:pStyle w:val="Heading1"/>
@@ -18246,7 +19244,7 @@
         <w:t xml:space="preserve">rendu réel de l’application (Flask + Bootstrap).</w:t>
       </w:r>
     </w:p>
-    <w:bookmarkStart w:id="136" w:name="laccès-sécurisé-page-de-connexion"/>
+    <w:bookmarkStart w:id="149" w:name="laccès-sécurisé-page-de-connexion"/>
     <w:p>
       <w:pPr>
         <w:pStyle w:val="Heading2"/>
@@ -18334,18 +19332,18 @@
           <wp:inline>
             <wp:extent cx="5334000" cy="3389393"/>
             <wp:effectExtent b="0" l="0" r="0" t="0"/>
-            <wp:docPr descr="Figure 11 — Page de connexion sécurisée" title="" id="134" name="Picture"/>
+            <wp:docPr descr="Figure 11 — Page de connexion sécurisée" title="" id="147" name="Picture"/>
             <a:graphic>
               <a:graphicData uri="http://schemas.openxmlformats.org/drawingml/2006/picture">
                 <pic:pic>
                   <pic:nvPicPr>
-                    <pic:cNvPr descr="../soutenance/captures/capture-login.png" id="135" name="Picture"/>
+                    <pic:cNvPr descr="../soutenance/captures/capture-login.png" id="148" name="Picture"/>
                     <pic:cNvPicPr>
                       <a:picLocks noChangeArrowheads="1" noChangeAspect="1"/>
                     </pic:cNvPicPr>
                   </pic:nvPicPr>
                   <pic:blipFill>
-                    <a:blip r:embed="rId133"/>
+                    <a:blip r:embed="rId146"/>
                     <a:stretch>
                       <a:fillRect/>
                     </a:stretch>
@@ -18380,8 +19378,8 @@
         <w:t xml:space="preserve">Figure 11 — Page de connexion sécurisée</w:t>
       </w:r>
     </w:p>
-    <w:bookmarkEnd w:id="136"/>
-    <w:bookmarkStart w:id="140" w:name="le-tableau-de-bord"/>
+    <w:bookmarkEnd w:id="149"/>
+    <w:bookmarkStart w:id="153" w:name="le-tableau-de-bord"/>
     <w:p>
       <w:pPr>
         <w:pStyle w:val="Heading2"/>
@@ -18556,18 +19554,18 @@
           <wp:inline>
             <wp:extent cx="5334000" cy="3389393"/>
             <wp:effectExtent b="0" l="0" r="0" t="0"/>
-            <wp:docPr descr="Figure 12 — Tableau de bord temps réel" title="" id="138" name="Picture"/>
+            <wp:docPr descr="Figure 12 — Tableau de bord temps réel" title="" id="151" name="Picture"/>
             <a:graphic>
               <a:graphicData uri="http://schemas.openxmlformats.org/drawingml/2006/picture">
                 <pic:pic>
                   <pic:nvPicPr>
-                    <pic:cNvPr descr="../soutenance/captures/capture-dashboard.png" id="139" name="Picture"/>
+                    <pic:cNvPr descr="../soutenance/captures/capture-dashboard.png" id="152" name="Picture"/>
                     <pic:cNvPicPr>
                       <a:picLocks noChangeArrowheads="1" noChangeAspect="1"/>
                     </pic:cNvPicPr>
                   </pic:nvPicPr>
                   <pic:blipFill>
-                    <a:blip r:embed="rId137"/>
+                    <a:blip r:embed="rId150"/>
                     <a:stretch>
                       <a:fillRect/>
                     </a:stretch>
@@ -18638,8 +19636,8 @@
         <w:t xml:space="preserve">de tous les parcs supervisés.</w:t>
       </w:r>
     </w:p>
-    <w:bookmarkEnd w:id="140"/>
-    <w:bookmarkStart w:id="144" w:name="Xdbf95e1757e3040a3287655e76e7e26d4071977"/>
+    <w:bookmarkEnd w:id="153"/>
+    <w:bookmarkStart w:id="157" w:name="Xdbf95e1757e3040a3287655e76e7e26d4071977"/>
     <w:p>
       <w:pPr>
         <w:pStyle w:val="Heading2"/>
@@ -18725,18 +19723,18 @@
           <wp:inline>
             <wp:extent cx="4239490" cy="7758545"/>
             <wp:effectExtent b="0" l="0" r="0" t="0"/>
-            <wp:docPr descr="Figure 13 — Notification Telegram reçue par l’astreinte (smartphone)" title="" id="142" name="Picture"/>
+            <wp:docPr descr="Figure 13 — Notification Telegram reçue par l’astreinte (smartphone)" title="" id="155" name="Picture"/>
             <a:graphic>
               <a:graphicData uri="http://schemas.openxmlformats.org/drawingml/2006/picture">
                 <pic:pic>
                   <pic:nvPicPr>
-                    <pic:cNvPr descr="../soutenance/captures/capture-telegram.png" id="143" name="Picture"/>
+                    <pic:cNvPr descr="../soutenance/captures/capture-telegram.png" id="156" name="Picture"/>
                     <pic:cNvPicPr>
                       <a:picLocks noChangeArrowheads="1" noChangeAspect="1"/>
                     </pic:cNvPicPr>
                   </pic:nvPicPr>
                   <pic:blipFill>
-                    <a:blip r:embed="rId141"/>
+                    <a:blip r:embed="rId154"/>
                     <a:stretch>
                       <a:fillRect/>
                     </a:stretch>
@@ -18817,8 +19815,8 @@
         <w:t xml:space="preserve">drastiquement le temps de réaction.</w:t>
       </w:r>
     </w:p>
-    <w:bookmarkEnd w:id="144"/>
-    <w:bookmarkStart w:id="148" w:name="lhistorique-des-alertes"/>
+    <w:bookmarkEnd w:id="157"/>
+    <w:bookmarkStart w:id="161" w:name="lhistorique-des-alertes"/>
     <w:p>
       <w:pPr>
         <w:pStyle w:val="Heading2"/>
@@ -18930,18 +19928,18 @@
           <wp:inline>
             <wp:extent cx="5334000" cy="3389393"/>
             <wp:effectExtent b="0" l="0" r="0" t="0"/>
-            <wp:docPr descr="Figure 14 — Historique des alertes" title="" id="146" name="Picture"/>
+            <wp:docPr descr="Figure 14 — Historique des alertes" title="" id="159" name="Picture"/>
             <a:graphic>
               <a:graphicData uri="http://schemas.openxmlformats.org/drawingml/2006/picture">
                 <pic:pic>
                   <pic:nvPicPr>
-                    <pic:cNvPr descr="../soutenance/captures/capture-alertes.png" id="147" name="Picture"/>
+                    <pic:cNvPr descr="../soutenance/captures/capture-alertes.png" id="160" name="Picture"/>
                     <pic:cNvPicPr>
                       <a:picLocks noChangeArrowheads="1" noChangeAspect="1"/>
                     </pic:cNvPicPr>
                   </pic:nvPicPr>
                   <pic:blipFill>
-                    <a:blip r:embed="rId145"/>
+                    <a:blip r:embed="rId158"/>
                     <a:stretch>
                       <a:fillRect/>
                     </a:stretch>
@@ -18976,8 +19974,8 @@
         <w:t xml:space="preserve">Figure 14 — Historique des alertes</w:t>
       </w:r>
     </w:p>
-    <w:bookmarkEnd w:id="148"/>
-    <w:bookmarkStart w:id="152" w:name="la-gestion-des-équipements"/>
+    <w:bookmarkEnd w:id="161"/>
+    <w:bookmarkStart w:id="165" w:name="la-gestion-des-équipements"/>
     <w:p>
       <w:pPr>
         <w:pStyle w:val="Heading2"/>
@@ -19066,18 +20064,18 @@
           <wp:inline>
             <wp:extent cx="5334000" cy="3389393"/>
             <wp:effectExtent b="0" l="0" r="0" t="0"/>
-            <wp:docPr descr="Figure 15 — Gestion des équipements" title="" id="150" name="Picture"/>
+            <wp:docPr descr="Figure 15 — Gestion des équipements" title="" id="163" name="Picture"/>
             <a:graphic>
               <a:graphicData uri="http://schemas.openxmlformats.org/drawingml/2006/picture">
                 <pic:pic>
                   <pic:nvPicPr>
-                    <pic:cNvPr descr="../soutenance/captures/capture-equipements.png" id="151" name="Picture"/>
+                    <pic:cNvPr descr="../soutenance/captures/capture-equipements.png" id="164" name="Picture"/>
                     <pic:cNvPicPr>
                       <a:picLocks noChangeArrowheads="1" noChangeAspect="1"/>
                     </pic:cNvPicPr>
                   </pic:nvPicPr>
                   <pic:blipFill>
-                    <a:blip r:embed="rId149"/>
+                    <a:blip r:embed="rId162"/>
                     <a:stretch>
                       <a:fillRect/>
                     </a:stretch>
@@ -19112,8 +20110,8 @@
         <w:t xml:space="preserve">Figure 15 — Gestion des équipements</w:t>
       </w:r>
     </w:p>
-    <w:bookmarkEnd w:id="152"/>
-    <w:bookmarkStart w:id="156" w:name="les-rapports-et-statistiques"/>
+    <w:bookmarkEnd w:id="165"/>
+    <w:bookmarkStart w:id="169" w:name="les-rapports-et-statistiques"/>
     <w:p>
       <w:pPr>
         <w:pStyle w:val="Heading2"/>
@@ -19221,18 +20219,18 @@
           <wp:inline>
             <wp:extent cx="5334000" cy="3389393"/>
             <wp:effectExtent b="0" l="0" r="0" t="0"/>
-            <wp:docPr descr="Figure 16 — Rapports et statistiques" title="" id="154" name="Picture"/>
+            <wp:docPr descr="Figure 16 — Rapports et statistiques" title="" id="167" name="Picture"/>
             <a:graphic>
               <a:graphicData uri="http://schemas.openxmlformats.org/drawingml/2006/picture">
                 <pic:pic>
                   <pic:nvPicPr>
-                    <pic:cNvPr descr="../soutenance/captures/capture-rapports.png" id="155" name="Picture"/>
+                    <pic:cNvPr descr="../soutenance/captures/capture-rapports.png" id="168" name="Picture"/>
                     <pic:cNvPicPr>
                       <a:picLocks noChangeArrowheads="1" noChangeAspect="1"/>
                     </pic:cNvPicPr>
                   </pic:nvPicPr>
                   <pic:blipFill>
-                    <a:blip r:embed="rId153"/>
+                    <a:blip r:embed="rId166"/>
                     <a:stretch>
                       <a:fillRect/>
                     </a:stretch>
@@ -19267,8 +20265,8 @@
         <w:t xml:space="preserve">Figure 16 — Rapports et statistiques</w:t>
       </w:r>
     </w:p>
-    <w:bookmarkEnd w:id="156"/>
-    <w:bookmarkStart w:id="157" w:name="synthèse-de-la-démonstration"/>
+    <w:bookmarkEnd w:id="169"/>
+    <w:bookmarkStart w:id="170" w:name="synthèse-de-la-démonstration"/>
     <w:p>
       <w:pPr>
         <w:pStyle w:val="Heading2"/>
@@ -19577,9 +20575,9 @@
         <w:br w:type="page"/>
       </w:r>
     </w:p>
-    <w:bookmarkEnd w:id="157"/>
-    <w:bookmarkEnd w:id="158"/>
-    <w:bookmarkStart w:id="166" w:name="X1d94063eb3eba18a4d01908d274a1cf536b5412"/>
+    <w:bookmarkEnd w:id="170"/>
+    <w:bookmarkEnd w:id="171"/>
+    <w:bookmarkStart w:id="179" w:name="X1d94063eb3eba18a4d01908d274a1cf536b5412"/>
     <w:p>
       <w:pPr>
         <w:pStyle w:val="Heading1"/>
@@ -19588,7 +20586,7 @@
         <w:t xml:space="preserve">CHAPITRE 9 — MARKETING, VENTE ET CONCURRENCE</w:t>
       </w:r>
     </w:p>
-    <w:bookmarkStart w:id="159" w:name="une-double-valeur"/>
+    <w:bookmarkStart w:id="172" w:name="une-double-valeur"/>
     <w:p>
       <w:pPr>
         <w:pStyle w:val="Heading2"/>
@@ -19726,8 +20724,8 @@
         <w:t xml:space="preserve">portefeuille et à de nouveaux prospects.</w:t>
       </w:r>
     </w:p>
-    <w:bookmarkEnd w:id="159"/>
-    <w:bookmarkStart w:id="160" w:name="segmentation-et-cible"/>
+    <w:bookmarkEnd w:id="172"/>
+    <w:bookmarkStart w:id="173" w:name="segmentation-et-cible"/>
     <w:p>
       <w:pPr>
         <w:pStyle w:val="Heading2"/>
@@ -19838,8 +20836,8 @@
         <w:t xml:space="preserve">partenaires.</w:t>
       </w:r>
     </w:p>
-    <w:bookmarkEnd w:id="160"/>
-    <w:bookmarkStart w:id="161" w:name="proposition-de-valeur"/>
+    <w:bookmarkEnd w:id="173"/>
+    <w:bookmarkStart w:id="174" w:name="proposition-de-valeur"/>
     <w:p>
       <w:pPr>
         <w:pStyle w:val="Heading2"/>
@@ -19917,8 +20915,8 @@
         <w:t xml:space="preserve">, proactif et contractualisé.</w:t>
       </w:r>
     </w:p>
-    <w:bookmarkEnd w:id="161"/>
-    <w:bookmarkStart w:id="162" w:name="Xa71b5832fce9554d33b93c359c3b9ab09641ec1"/>
+    <w:bookmarkEnd w:id="174"/>
+    <w:bookmarkStart w:id="175" w:name="Xa71b5832fce9554d33b93c359c3b9ab09641ec1"/>
     <w:p>
       <w:pPr>
         <w:pStyle w:val="Heading2"/>
@@ -20137,8 +21135,8 @@
         </w:tc>
       </w:tr>
     </w:tbl>
-    <w:bookmarkEnd w:id="162"/>
-    <w:bookmarkStart w:id="163" w:name="positionnement-concurrentiel"/>
+    <w:bookmarkEnd w:id="175"/>
+    <w:bookmarkStart w:id="176" w:name="positionnement-concurrentiel"/>
     <w:p>
       <w:pPr>
         <w:pStyle w:val="Heading2"/>
@@ -20553,8 +21551,8 @@
         <w:t xml:space="preserve">solutions internationales sont trop chères ou trop lourdes.</w:t>
       </w:r>
     </w:p>
-    <w:bookmarkEnd w:id="163"/>
-    <w:bookmarkStart w:id="164" w:name="plan-daction-commercial"/>
+    <w:bookmarkEnd w:id="176"/>
+    <w:bookmarkStart w:id="177" w:name="plan-daction-commercial"/>
     <w:p>
       <w:pPr>
         <w:pStyle w:val="Heading2"/>
@@ -20692,8 +21690,8 @@
         <w:t xml:space="preserve">de nouveaux clients sur la base des résultats mesurés.</w:t>
       </w:r>
     </w:p>
-    <w:bookmarkEnd w:id="164"/>
-    <w:bookmarkStart w:id="165" w:name="analyse-swot-de-loffre"/>
+    <w:bookmarkEnd w:id="177"/>
+    <w:bookmarkStart w:id="178" w:name="analyse-swot-de-loffre"/>
     <w:p>
       <w:pPr>
         <w:pStyle w:val="Heading2"/>
@@ -21066,9 +22064,9 @@
         <w:br w:type="page"/>
       </w:r>
     </w:p>
-    <w:bookmarkEnd w:id="165"/>
-    <w:bookmarkEnd w:id="166"/>
-    <w:bookmarkStart w:id="172" w:name="chapitre-10-prévisions-financières"/>
+    <w:bookmarkEnd w:id="178"/>
+    <w:bookmarkEnd w:id="179"/>
+    <w:bookmarkStart w:id="185" w:name="chapitre-10-prévisions-financières"/>
     <w:p>
       <w:pPr>
         <w:pStyle w:val="Heading1"/>
@@ -21117,7 +22115,7 @@
         <w:t xml:space="preserve">pratiqués sur le marché ivoirien.</w:t>
       </w:r>
     </w:p>
-    <w:bookmarkStart w:id="167" w:name="investissement-initial"/>
+    <w:bookmarkStart w:id="180" w:name="investissement-initial"/>
     <w:p>
       <w:pPr>
         <w:pStyle w:val="Heading2"/>
@@ -21319,8 +22317,8 @@
         <w:t xml:space="preserve">mutualisable, développement réalisé en interne dans le cadre de ce projet.</w:t>
       </w:r>
     </w:p>
-    <w:bookmarkEnd w:id="167"/>
-    <w:bookmarkStart w:id="168" w:name="revenus-et-gains-prévisionnels-année-1"/>
+    <w:bookmarkEnd w:id="180"/>
+    <w:bookmarkStart w:id="181" w:name="revenus-et-gains-prévisionnels-année-1"/>
     <w:p>
       <w:pPr>
         <w:pStyle w:val="Heading2"/>
@@ -21577,8 +22575,8 @@
         </w:tc>
       </w:tr>
     </w:tbl>
-    <w:bookmarkEnd w:id="168"/>
-    <w:bookmarkStart w:id="169" w:name="analyse-de-rentabilité-et-seuil-critique"/>
+    <w:bookmarkEnd w:id="181"/>
+    <w:bookmarkStart w:id="182" w:name="analyse-de-rentabilité-et-seuil-critique"/>
     <w:p>
       <w:pPr>
         <w:pStyle w:val="Heading2"/>
@@ -21753,8 +22751,8 @@
         <w:t xml:space="preserve">avec le nombre de clients.</w:t>
       </w:r>
     </w:p>
-    <w:bookmarkEnd w:id="169"/>
-    <w:bookmarkStart w:id="170" w:name="gains-internes-économies"/>
+    <w:bookmarkEnd w:id="182"/>
+    <w:bookmarkStart w:id="183" w:name="gains-internes-économies"/>
     <w:p>
       <w:pPr>
         <w:pStyle w:val="Heading2"/>
@@ -21895,8 +22893,8 @@
         <w:t xml:space="preserve">coût de renouvellement du portefeuille.</w:t>
       </w:r>
     </w:p>
-    <w:bookmarkEnd w:id="170"/>
-    <w:bookmarkStart w:id="171" w:name="synthèse-financière"/>
+    <w:bookmarkEnd w:id="183"/>
+    <w:bookmarkStart w:id="184" w:name="synthèse-financière"/>
     <w:p>
       <w:pPr>
         <w:pStyle w:val="Heading2"/>
@@ -22095,9 +23093,9 @@
         <w:br w:type="page"/>
       </w:r>
     </w:p>
-    <w:bookmarkEnd w:id="171"/>
-    <w:bookmarkEnd w:id="172"/>
-    <w:bookmarkStart w:id="176" w:name="Xbff6087c977180356b35aa07229e7b0cff1becb"/>
+    <w:bookmarkEnd w:id="184"/>
+    <w:bookmarkEnd w:id="185"/>
+    <w:bookmarkStart w:id="189" w:name="Xbff6087c977180356b35aa07229e7b0cff1becb"/>
     <w:p>
       <w:pPr>
         <w:pStyle w:val="Heading1"/>
@@ -22106,7 +23104,7 @@
         <w:t xml:space="preserve">CHAPITRE 11 — LIMITES DU PROJET ET PERSPECTIVES</w:t>
       </w:r>
     </w:p>
-    <w:bookmarkStart w:id="173" w:name="limites-du-projet"/>
+    <w:bookmarkStart w:id="186" w:name="limites-du-projet"/>
     <w:p>
       <w:pPr>
         <w:pStyle w:val="Heading2"/>
@@ -22345,8 +23343,8 @@
         <w:t xml:space="preserve">commerciale à grande échelle.</w:t>
       </w:r>
     </w:p>
-    <w:bookmarkEnd w:id="173"/>
-    <w:bookmarkStart w:id="174" w:name="recommandations-opérationnelles"/>
+    <w:bookmarkEnd w:id="186"/>
+    <w:bookmarkStart w:id="187" w:name="recommandations-opérationnelles"/>
     <w:p>
       <w:pPr>
         <w:pStyle w:val="Heading2"/>
@@ -22531,8 +23529,8 @@
         <w:t xml:space="preserve">critiques.</w:t>
       </w:r>
     </w:p>
-    <w:bookmarkEnd w:id="174"/>
-    <w:bookmarkStart w:id="175" w:name="perspectives-dévolution"/>
+    <w:bookmarkEnd w:id="187"/>
+    <w:bookmarkStart w:id="188" w:name="perspectives-dévolution"/>
     <w:p>
       <w:pPr>
         <w:pStyle w:val="Heading2"/>
@@ -22830,9 +23828,9 @@
         <w:br w:type="page"/>
       </w:r>
     </w:p>
-    <w:bookmarkEnd w:id="175"/>
-    <w:bookmarkEnd w:id="176"/>
-    <w:bookmarkStart w:id="177" w:name="conclusion-générale"/>
+    <w:bookmarkEnd w:id="188"/>
+    <w:bookmarkEnd w:id="189"/>
+    <w:bookmarkStart w:id="190" w:name="conclusion-générale"/>
     <w:p>
       <w:pPr>
         <w:pStyle w:val="Heading1"/>
@@ -23558,8 +24556,8 @@
         <w:br w:type="page"/>
       </w:r>
     </w:p>
-    <w:bookmarkEnd w:id="177"/>
-    <w:bookmarkStart w:id="178" w:name="bibliographie"/>
+    <w:bookmarkEnd w:id="190"/>
+    <w:bookmarkStart w:id="191" w:name="bibliographie"/>
     <w:p>
       <w:pPr>
         <w:pStyle w:val="Heading1"/>
@@ -24074,8 +25072,8 @@
         <w:br w:type="page"/>
       </w:r>
     </w:p>
-    <w:bookmarkEnd w:id="178"/>
-    <w:bookmarkStart w:id="179" w:name="annexes"/>
+    <w:bookmarkEnd w:id="191"/>
+    <w:bookmarkStart w:id="192" w:name="annexes"/>
     <w:p>
       <w:pPr>
         <w:pStyle w:val="Heading1"/>
@@ -24456,7 +25454,7 @@
         <w:t xml:space="preserve">— FIN DU MÉMOIRE —</w:t>
       </w:r>
     </w:p>
-    <w:bookmarkEnd w:id="179"/>
+    <w:bookmarkEnd w:id="192"/>
     <w:sectPr>
       <w:headerReference w:type="default" r:id="rId12"/>
       <w:footerReference w:type="default" r:id="rId13"/>

</xml_diff>

<commit_message>
Memoire : section 8.8 (deploiement et validation en conditions reelles) + resume/conclusion actualises
</commit_message>
<xml_diff>
--- a/memoire/Memoire-KOUASSI-ESPERANCE-CERCO.docx
+++ b/memoire/Memoire-KOUASSI-ESPERANCE-CERCO.docx
@@ -1366,13 +1366,7 @@
         <w:t xml:space="preserve"> </w:t>
       </w:r>
       <w:r>
-        <w:t xml:space="preserve">du</w:t>
-      </w:r>
-      <w:r>
-        <w:t xml:space="preserve"> </w:t>
-      </w:r>
-      <w:r>
-        <w:t xml:space="preserve">parc supervisé, le tout pour un</w:t>
+        <w:t xml:space="preserve">du parc supervisé, le tout pour un</w:t>
       </w:r>
       <w:r>
         <w:t xml:space="preserve"> </w:t>
@@ -1385,7 +1379,23 @@
         <w:t xml:space="preserve">coût de licence nul</w:t>
       </w:r>
       <w:r>
-        <w:t xml:space="preserve">. Au-delà de l’outil interne,</w:t>
+        <w:t xml:space="preserve">. Le prototype a par ailleurs été</w:t>
+      </w:r>
+      <w:r>
+        <w:t xml:space="preserve"> </w:t>
+      </w:r>
+      <w:r>
+        <w:rPr>
+          <w:bCs/>
+          <w:b/>
+        </w:rPr>
+        <w:t xml:space="preserve">déployé et validé en conditions réelles</w:t>
+      </w:r>
+      <w:r>
+        <w:t xml:space="preserve"> </w:t>
+      </w:r>
+      <w:r>
+        <w:t xml:space="preserve">: sur un réseau d’une soixantaine d’équipements, une panne a été détectée en moins de deux minutes et a déclenché simultanément une alerte Telegram et un courriel. Au-delà de l’outil interne,</w:t>
       </w:r>
       <w:r>
         <w:t xml:space="preserve"> </w:t>
@@ -19564,7 +19574,7 @@
     </w:p>
     <w:bookmarkEnd w:id="146"/>
     <w:bookmarkEnd w:id="147"/>
-    <w:bookmarkStart w:id="173" w:name="Xa42a75fe599b82e8151160d564170687d0c2dcf"/>
+    <w:bookmarkStart w:id="174" w:name="Xa42a75fe599b82e8151160d564170687d0c2dcf"/>
     <w:p>
       <w:pPr>
         <w:pStyle w:val="Heading1"/>
@@ -20949,14 +20959,495 @@
         <w:t xml:space="preserve">instantanée de l’astreinte et au reporting exploitable au profit du client.</w:t>
       </w:r>
     </w:p>
+    <w:bookmarkEnd w:id="172"/>
+    <w:bookmarkStart w:id="173" w:name="X4072a45c8d1c37e8902551075631040889d6809"/>
+    <w:p>
+      <w:pPr>
+        <w:pStyle w:val="Heading2"/>
+      </w:pPr>
+      <w:r>
+        <w:t xml:space="preserve">8.8 Déploiement et validation en conditions réelles</w:t>
+      </w:r>
+    </w:p>
+    <w:p>
+      <w:pPr>
+        <w:pStyle w:val="FirstParagraph"/>
+      </w:pPr>
+      <w:r>
+        <w:t xml:space="preserve">Au-delà de la maquette illustrée ci-dessus, la solution</w:t>
+      </w:r>
+      <w:r>
+        <w:t xml:space="preserve"> </w:t>
+      </w:r>
+      <w:r>
+        <w:rPr>
+          <w:bCs/>
+          <w:b/>
+        </w:rPr>
+        <w:t xml:space="preserve">Awali</w:t>
+      </w:r>
+      <w:r>
+        <w:t xml:space="preserve"> </w:t>
+      </w:r>
+      <w:r>
+        <w:t xml:space="preserve">a été</w:t>
+      </w:r>
+      <w:r>
+        <w:t xml:space="preserve"> </w:t>
+      </w:r>
+      <w:r>
+        <w:rPr>
+          <w:bCs/>
+          <w:b/>
+        </w:rPr>
+        <w:t xml:space="preserve">réellement déployée et validée</w:t>
+      </w:r>
+      <w:r>
+        <w:t xml:space="preserve"> </w:t>
+      </w:r>
+      <w:r>
+        <w:t xml:space="preserve">sur un environnement opérationnel. Le moteur de supervision et le tableau de bord ont été installés sur un</w:t>
+      </w:r>
+      <w:r>
+        <w:t xml:space="preserve"> </w:t>
+      </w:r>
+      <w:r>
+        <w:rPr>
+          <w:bCs/>
+          <w:b/>
+        </w:rPr>
+        <w:t xml:space="preserve">serveur Ubuntu</w:t>
+      </w:r>
+      <w:r>
+        <w:t xml:space="preserve"> </w:t>
+      </w:r>
+      <w:r>
+        <w:t xml:space="preserve">(machine virtuelle, adresse fixe</w:t>
+      </w:r>
+      <w:r>
+        <w:t xml:space="preserve"> </w:t>
+      </w:r>
+      <w:r>
+        <w:rPr>
+          <w:rStyle w:val="VerbatimChar"/>
+        </w:rPr>
+        <w:t xml:space="preserve">192.168.1.50</w:t>
+      </w:r>
+      <w:r>
+        <w:t xml:space="preserve">), adossés à la base</w:t>
+      </w:r>
+      <w:r>
+        <w:t xml:space="preserve"> </w:t>
+      </w:r>
+      <w:r>
+        <w:rPr>
+          <w:bCs/>
+          <w:b/>
+        </w:rPr>
+        <w:t xml:space="preserve">MySQL</w:t>
+      </w:r>
+      <w:r>
+        <w:t xml:space="preserve"> </w:t>
+      </w:r>
+      <w:r>
+        <w:t xml:space="preserve">et au tableau de bord</w:t>
+      </w:r>
+      <w:r>
+        <w:t xml:space="preserve"> </w:t>
+      </w:r>
+      <w:r>
+        <w:rPr>
+          <w:bCs/>
+          <w:b/>
+        </w:rPr>
+        <w:t xml:space="preserve">Flask</w:t>
+      </w:r>
+      <w:r>
+        <w:t xml:space="preserve">, puis</w:t>
+      </w:r>
+      <w:r>
+        <w:t xml:space="preserve"> </w:t>
+      </w:r>
+      <w:r>
+        <w:rPr>
+          <w:bCs/>
+          <w:b/>
+        </w:rPr>
+        <w:t xml:space="preserve">automatisés par Cron</w:t>
+      </w:r>
+      <w:r>
+        <w:t xml:space="preserve"> </w:t>
+      </w:r>
+      <w:r>
+        <w:t xml:space="preserve">: un cycle de supervision toutes les</w:t>
+      </w:r>
+      <w:r>
+        <w:t xml:space="preserve"> </w:t>
+      </w:r>
+      <w:r>
+        <w:rPr>
+          <w:bCs/>
+          <w:b/>
+        </w:rPr>
+        <w:t xml:space="preserve">deux minutes</w:t>
+      </w:r>
+      <w:r>
+        <w:t xml:space="preserve"> </w:t>
+      </w:r>
+      <w:r>
+        <w:t xml:space="preserve">et une découverte du réseau quotidienne.</w:t>
+      </w:r>
+    </w:p>
+    <w:p>
+      <w:pPr>
+        <w:pStyle w:val="BodyText"/>
+      </w:pPr>
+      <w:r>
+        <w:t xml:space="preserve">La</w:t>
+      </w:r>
+      <w:r>
+        <w:t xml:space="preserve"> </w:t>
+      </w:r>
+      <w:r>
+        <w:rPr>
+          <w:bCs/>
+          <w:b/>
+        </w:rPr>
+        <w:t xml:space="preserve">découverte automatique</w:t>
+      </w:r>
+      <w:r>
+        <w:t xml:space="preserve"> </w:t>
+      </w:r>
+      <w:r>
+        <w:t xml:space="preserve">lancée sur le sous-réseau</w:t>
+      </w:r>
+      <w:r>
+        <w:t xml:space="preserve"> </w:t>
+      </w:r>
+      <w:r>
+        <w:rPr>
+          <w:rStyle w:val="VerbatimChar"/>
+        </w:rPr>
+        <w:t xml:space="preserve">192.168.1.0/24</w:t>
+      </w:r>
+      <w:r>
+        <w:t xml:space="preserve"> </w:t>
+      </w:r>
+      <w:r>
+        <w:t xml:space="preserve">a recensé une</w:t>
+      </w:r>
+      <w:r>
+        <w:t xml:space="preserve"> </w:t>
+      </w:r>
+      <w:r>
+        <w:rPr>
+          <w:bCs/>
+          <w:b/>
+        </w:rPr>
+        <w:t xml:space="preserve">soixantaine d’équipements</w:t>
+      </w:r>
+      <w:r>
+        <w:t xml:space="preserve"> </w:t>
+      </w:r>
+      <w:r>
+        <w:t xml:space="preserve">actifs, immédiatement supervisés. Le taux de disponibilité et l’état de chaque hôte (UP/DOWN, latence, horodatage) sont</w:t>
+      </w:r>
+      <w:r>
+        <w:t xml:space="preserve"> </w:t>
+      </w:r>
+      <w:r>
+        <w:rPr>
+          <w:bCs/>
+          <w:b/>
+        </w:rPr>
+        <w:t xml:space="preserve">calculés et affichés en temps réel</w:t>
+      </w:r>
+      <w:r>
+        <w:t xml:space="preserve"> </w:t>
+      </w:r>
+      <w:r>
+        <w:t xml:space="preserve">sur le tableau de bord, avec rafraîchissement automatique (figure 17).</w:t>
+      </w:r>
+    </w:p>
+    <w:p>
+      <w:pPr>
+        <w:pStyle w:val="BodyText"/>
+      </w:pPr>
+      <w:r>
+        <w:rPr>
+          <w:iCs/>
+          <w:i/>
+        </w:rPr>
+        <w:t xml:space="preserve">[Figure 17 — Tableau de bord en conditions réelles (≈ 63 équipements supervisés) — capture à insérer]</w:t>
+      </w:r>
+    </w:p>
+    <w:p>
+      <w:pPr>
+        <w:pStyle w:val="BodyText"/>
+      </w:pPr>
+      <w:r>
+        <w:t xml:space="preserve">Pour valider la</w:t>
+      </w:r>
+      <w:r>
+        <w:t xml:space="preserve"> </w:t>
+      </w:r>
+      <w:r>
+        <w:rPr>
+          <w:bCs/>
+          <w:b/>
+        </w:rPr>
+        <w:t xml:space="preserve">chaîne d’alerte de bout en bout</w:t>
+      </w:r>
+      <w:r>
+        <w:t xml:space="preserve">, une panne a été provoquée sur un équipement (</w:t>
+      </w:r>
+      <w:r>
+        <w:rPr>
+          <w:rStyle w:val="VerbatimChar"/>
+        </w:rPr>
+        <w:t xml:space="preserve">hote-192-168-1-124</w:t>
+      </w:r>
+      <w:r>
+        <w:t xml:space="preserve">). Après deux cycles d’échec consécutifs — soit</w:t>
+      </w:r>
+      <w:r>
+        <w:t xml:space="preserve"> </w:t>
+      </w:r>
+      <w:r>
+        <w:rPr>
+          <w:bCs/>
+          <w:b/>
+        </w:rPr>
+        <w:t xml:space="preserve">moins de deux minutes</w:t>
+      </w:r>
+      <w:r>
+        <w:t xml:space="preserve"> </w:t>
+      </w:r>
+      <w:r>
+        <w:t xml:space="preserve">—, le système a confirmé la panne et</w:t>
+      </w:r>
+      <w:r>
+        <w:t xml:space="preserve"> </w:t>
+      </w:r>
+      <w:r>
+        <w:rPr>
+          <w:bCs/>
+          <w:b/>
+        </w:rPr>
+        <w:t xml:space="preserve">émis simultanément l’alerte sur les deux canaux</w:t>
+      </w:r>
+      <w:r>
+        <w:t xml:space="preserve"> </w:t>
+      </w:r>
+      <w:r>
+        <w:t xml:space="preserve">: une</w:t>
+      </w:r>
+      <w:r>
+        <w:t xml:space="preserve"> </w:t>
+      </w:r>
+      <w:r>
+        <w:rPr>
+          <w:bCs/>
+          <w:b/>
+        </w:rPr>
+        <w:t xml:space="preserve">notification Telegram</w:t>
+      </w:r>
+      <w:r>
+        <w:t xml:space="preserve"> </w:t>
+      </w:r>
+      <w:r>
+        <w:t xml:space="preserve">reçue instantanément sur smartphone (figure 18) et un</w:t>
+      </w:r>
+      <w:r>
+        <w:t xml:space="preserve"> </w:t>
+      </w:r>
+      <w:r>
+        <w:rPr>
+          <w:bCs/>
+          <w:b/>
+        </w:rPr>
+        <w:t xml:space="preserve">courriel</w:t>
+      </w:r>
+      <w:r>
+        <w:t xml:space="preserve"> </w:t>
+      </w:r>
+      <w:r>
+        <w:t xml:space="preserve">délivré dans la boîte de réception (figure 19). Les deux messages portent les mêmes informations (équipement, adresse IP, type</w:t>
+      </w:r>
+      <w:r>
+        <w:t xml:space="preserve"> </w:t>
+      </w:r>
+      <w:r>
+        <w:rPr>
+          <w:rStyle w:val="VerbatimChar"/>
+        </w:rPr>
+        <w:t xml:space="preserve">PANNE_RESEAU</w:t>
+      </w:r>
+      <w:r>
+        <w:t xml:space="preserve">, sévérité</w:t>
+      </w:r>
+      <w:r>
+        <w:t xml:space="preserve"> </w:t>
+      </w:r>
+      <w:r>
+        <w:rPr>
+          <w:rStyle w:val="VerbatimChar"/>
+        </w:rPr>
+        <w:t xml:space="preserve">CRITIQUE</w:t>
+      </w:r>
+      <w:r>
+        <w:t xml:space="preserve"> </w:t>
+      </w:r>
+      <w:r>
+        <w:t xml:space="preserve">et détail), preuve de la cohérence du dispositif.</w:t>
+      </w:r>
+    </w:p>
+    <w:p>
+      <w:pPr>
+        <w:pStyle w:val="BodyText"/>
+      </w:pPr>
+      <w:r>
+        <w:rPr>
+          <w:iCs/>
+          <w:i/>
+        </w:rPr>
+        <w:t xml:space="preserve">[Figure 18 — Alerte Telegram reçue sur smartphone (incident réel) — capture à insérer]</w:t>
+      </w:r>
+    </w:p>
+    <w:p>
+      <w:pPr>
+        <w:pStyle w:val="BodyText"/>
+      </w:pPr>
+      <w:r>
+        <w:rPr>
+          <w:iCs/>
+          <w:i/>
+        </w:rPr>
+        <w:t xml:space="preserve">[Figure 19 — Alerte e-mail reçue dans Gmail (même incident) — capture à insérer]</w:t>
+      </w:r>
+    </w:p>
+    <w:p>
+      <w:pPr>
+        <w:pStyle w:val="BodyText"/>
+      </w:pPr>
+      <w:r>
+        <w:t xml:space="preserve">Lorsque l’équipement est redevenu joignable, le système a automatiquement émis une</w:t>
+      </w:r>
+      <w:r>
+        <w:t xml:space="preserve"> </w:t>
+      </w:r>
+      <w:r>
+        <w:rPr>
+          <w:bCs/>
+          <w:b/>
+        </w:rPr>
+        <w:t xml:space="preserve">notification de rétablissement</w:t>
+      </w:r>
+      <w:r>
+        <w:t xml:space="preserve"> </w:t>
+      </w:r>
+      <w:r>
+        <w:t xml:space="preserve">et</w:t>
+      </w:r>
+      <w:r>
+        <w:t xml:space="preserve"> </w:t>
+      </w:r>
+      <w:r>
+        <w:rPr>
+          <w:bCs/>
+          <w:b/>
+        </w:rPr>
+        <w:t xml:space="preserve">soldé</w:t>
+      </w:r>
+      <w:r>
+        <w:t xml:space="preserve"> </w:t>
+      </w:r>
+      <w:r>
+        <w:t xml:space="preserve">l’alerte de panne associée. Cette validation confirme, en conditions réelles, l’atteinte des objectifs du projet :</w:t>
+      </w:r>
+      <w:r>
+        <w:t xml:space="preserve"> </w:t>
+      </w:r>
+      <w:r>
+        <w:rPr>
+          <w:bCs/>
+          <w:b/>
+        </w:rPr>
+        <w:t xml:space="preserve">détection en moins de deux minutes</w:t>
+      </w:r>
+      <w:r>
+        <w:t xml:space="preserve">,</w:t>
+      </w:r>
+      <w:r>
+        <w:t xml:space="preserve"> </w:t>
+      </w:r>
+      <w:r>
+        <w:rPr>
+          <w:bCs/>
+          <w:b/>
+        </w:rPr>
+        <w:t xml:space="preserve">alerte multi-canal instantanée</w:t>
+      </w:r>
+      <w:r>
+        <w:t xml:space="preserve"> </w:t>
+      </w:r>
+      <w:r>
+        <w:t xml:space="preserve">et</w:t>
+      </w:r>
+      <w:r>
+        <w:t xml:space="preserve"> </w:t>
+      </w:r>
+      <w:r>
+        <w:rPr>
+          <w:bCs/>
+          <w:b/>
+        </w:rPr>
+        <w:t xml:space="preserve">traçabilité complète</w:t>
+      </w:r>
+      <w:r>
+        <w:t xml:space="preserve"> </w:t>
+      </w:r>
+      <w:r>
+        <w:t xml:space="preserve">des incidents — le tout sur une pile</w:t>
+      </w:r>
+      <w:r>
+        <w:t xml:space="preserve"> </w:t>
+      </w:r>
+      <w:r>
+        <w:rPr>
+          <w:bCs/>
+          <w:b/>
+        </w:rPr>
+        <w:t xml:space="preserve">100 % open-source</w:t>
+      </w:r>
+      <w:r>
+        <w:t xml:space="preserve"> </w:t>
+      </w:r>
+      <w:r>
+        <w:t xml:space="preserve">et</w:t>
+      </w:r>
+      <w:r>
+        <w:t xml:space="preserve"> </w:t>
+      </w:r>
+      <w:r>
+        <w:rPr>
+          <w:bCs/>
+          <w:b/>
+        </w:rPr>
+        <w:t xml:space="preserve">sans aucun coût de licence</w:t>
+      </w:r>
+      <w:r>
+        <w:t xml:space="preserve">.</w:t>
+      </w:r>
+    </w:p>
     <w:p>
       <w:r>
         <w:br w:type="page"/>
       </w:r>
     </w:p>
-    <w:bookmarkEnd w:id="172"/>
     <w:bookmarkEnd w:id="173"/>
-    <w:bookmarkStart w:id="181" w:name="X1d94063eb3eba18a4d01908d274a1cf536b5412"/>
+    <w:bookmarkEnd w:id="174"/>
+    <w:bookmarkStart w:id="182" w:name="X1d94063eb3eba18a4d01908d274a1cf536b5412"/>
     <w:p>
       <w:pPr>
         <w:pStyle w:val="Heading1"/>
@@ -20965,7 +21456,7 @@
         <w:t xml:space="preserve">CHAPITRE 9 — MARKETING, VENTE ET CONCURRENCE</w:t>
       </w:r>
     </w:p>
-    <w:bookmarkStart w:id="174" w:name="une-double-valeur"/>
+    <w:bookmarkStart w:id="175" w:name="une-double-valeur"/>
     <w:p>
       <w:pPr>
         <w:pStyle w:val="Heading2"/>
@@ -21103,8 +21594,8 @@
         <w:t xml:space="preserve">portefeuille et à de nouveaux prospects.</w:t>
       </w:r>
     </w:p>
-    <w:bookmarkEnd w:id="174"/>
-    <w:bookmarkStart w:id="175" w:name="segmentation-et-cible"/>
+    <w:bookmarkEnd w:id="175"/>
+    <w:bookmarkStart w:id="176" w:name="segmentation-et-cible"/>
     <w:p>
       <w:pPr>
         <w:pStyle w:val="Heading2"/>
@@ -21215,8 +21706,8 @@
         <w:t xml:space="preserve">partenaires.</w:t>
       </w:r>
     </w:p>
-    <w:bookmarkEnd w:id="175"/>
-    <w:bookmarkStart w:id="176" w:name="proposition-de-valeur"/>
+    <w:bookmarkEnd w:id="176"/>
+    <w:bookmarkStart w:id="177" w:name="proposition-de-valeur"/>
     <w:p>
       <w:pPr>
         <w:pStyle w:val="Heading2"/>
@@ -21294,8 +21785,8 @@
         <w:t xml:space="preserve">, proactif et contractualisé.</w:t>
       </w:r>
     </w:p>
-    <w:bookmarkEnd w:id="176"/>
-    <w:bookmarkStart w:id="177" w:name="Xa71b5832fce9554d33b93c359c3b9ab09641ec1"/>
+    <w:bookmarkEnd w:id="177"/>
+    <w:bookmarkStart w:id="178" w:name="Xa71b5832fce9554d33b93c359c3b9ab09641ec1"/>
     <w:p>
       <w:pPr>
         <w:pStyle w:val="Heading2"/>
@@ -21514,8 +22005,8 @@
         </w:tc>
       </w:tr>
     </w:tbl>
-    <w:bookmarkEnd w:id="177"/>
-    <w:bookmarkStart w:id="178" w:name="positionnement-concurrentiel"/>
+    <w:bookmarkEnd w:id="178"/>
+    <w:bookmarkStart w:id="179" w:name="positionnement-concurrentiel"/>
     <w:p>
       <w:pPr>
         <w:pStyle w:val="Heading2"/>
@@ -21930,8 +22421,8 @@
         <w:t xml:space="preserve">solutions internationales sont trop chères ou trop lourdes.</w:t>
       </w:r>
     </w:p>
-    <w:bookmarkEnd w:id="178"/>
-    <w:bookmarkStart w:id="179" w:name="plan-daction-commercial"/>
+    <w:bookmarkEnd w:id="179"/>
+    <w:bookmarkStart w:id="180" w:name="plan-daction-commercial"/>
     <w:p>
       <w:pPr>
         <w:pStyle w:val="Heading2"/>
@@ -22069,8 +22560,8 @@
         <w:t xml:space="preserve">de nouveaux clients sur la base des résultats mesurés.</w:t>
       </w:r>
     </w:p>
-    <w:bookmarkEnd w:id="179"/>
-    <w:bookmarkStart w:id="180" w:name="analyse-swot-de-loffre"/>
+    <w:bookmarkEnd w:id="180"/>
+    <w:bookmarkStart w:id="181" w:name="analyse-swot-de-loffre"/>
     <w:p>
       <w:pPr>
         <w:pStyle w:val="Heading2"/>
@@ -22443,9 +22934,9 @@
         <w:br w:type="page"/>
       </w:r>
     </w:p>
-    <w:bookmarkEnd w:id="180"/>
     <w:bookmarkEnd w:id="181"/>
-    <w:bookmarkStart w:id="187" w:name="chapitre-10-prévisions-financières"/>
+    <w:bookmarkEnd w:id="182"/>
+    <w:bookmarkStart w:id="188" w:name="chapitre-10-prévisions-financières"/>
     <w:p>
       <w:pPr>
         <w:pStyle w:val="Heading1"/>
@@ -22494,7 +22985,7 @@
         <w:t xml:space="preserve">pratiqués sur le marché ivoirien.</w:t>
       </w:r>
     </w:p>
-    <w:bookmarkStart w:id="182" w:name="investissement-initial"/>
+    <w:bookmarkStart w:id="183" w:name="investissement-initial"/>
     <w:p>
       <w:pPr>
         <w:pStyle w:val="Heading2"/>
@@ -22696,8 +23187,8 @@
         <w:t xml:space="preserve">mutualisable, développement réalisé en interne dans le cadre de ce projet.</w:t>
       </w:r>
     </w:p>
-    <w:bookmarkEnd w:id="182"/>
-    <w:bookmarkStart w:id="183" w:name="revenus-et-gains-prévisionnels-année-1"/>
+    <w:bookmarkEnd w:id="183"/>
+    <w:bookmarkStart w:id="184" w:name="revenus-et-gains-prévisionnels-année-1"/>
     <w:p>
       <w:pPr>
         <w:pStyle w:val="Heading2"/>
@@ -22954,8 +23445,8 @@
         </w:tc>
       </w:tr>
     </w:tbl>
-    <w:bookmarkEnd w:id="183"/>
-    <w:bookmarkStart w:id="184" w:name="analyse-de-rentabilité-et-seuil-critique"/>
+    <w:bookmarkEnd w:id="184"/>
+    <w:bookmarkStart w:id="185" w:name="analyse-de-rentabilité-et-seuil-critique"/>
     <w:p>
       <w:pPr>
         <w:pStyle w:val="Heading2"/>
@@ -23130,8 +23621,8 @@
         <w:t xml:space="preserve">avec le nombre de clients.</w:t>
       </w:r>
     </w:p>
-    <w:bookmarkEnd w:id="184"/>
-    <w:bookmarkStart w:id="185" w:name="gains-internes-économies"/>
+    <w:bookmarkEnd w:id="185"/>
+    <w:bookmarkStart w:id="186" w:name="gains-internes-économies"/>
     <w:p>
       <w:pPr>
         <w:pStyle w:val="Heading2"/>
@@ -23272,8 +23763,8 @@
         <w:t xml:space="preserve">coût de renouvellement du portefeuille.</w:t>
       </w:r>
     </w:p>
-    <w:bookmarkEnd w:id="185"/>
-    <w:bookmarkStart w:id="186" w:name="synthèse-financière"/>
+    <w:bookmarkEnd w:id="186"/>
+    <w:bookmarkStart w:id="187" w:name="synthèse-financière"/>
     <w:p>
       <w:pPr>
         <w:pStyle w:val="Heading2"/>
@@ -23472,9 +23963,9 @@
         <w:br w:type="page"/>
       </w:r>
     </w:p>
-    <w:bookmarkEnd w:id="186"/>
     <w:bookmarkEnd w:id="187"/>
-    <w:bookmarkStart w:id="191" w:name="Xbff6087c977180356b35aa07229e7b0cff1becb"/>
+    <w:bookmarkEnd w:id="188"/>
+    <w:bookmarkStart w:id="192" w:name="Xbff6087c977180356b35aa07229e7b0cff1becb"/>
     <w:p>
       <w:pPr>
         <w:pStyle w:val="Heading1"/>
@@ -23483,7 +23974,7 @@
         <w:t xml:space="preserve">CHAPITRE 11 — LIMITES DU PROJET ET PERSPECTIVES</w:t>
       </w:r>
     </w:p>
-    <w:bookmarkStart w:id="188" w:name="limites-du-projet"/>
+    <w:bookmarkStart w:id="189" w:name="limites-du-projet"/>
     <w:p>
       <w:pPr>
         <w:pStyle w:val="Heading2"/>
@@ -23722,8 +24213,8 @@
         <w:t xml:space="preserve">commerciale à grande échelle.</w:t>
       </w:r>
     </w:p>
-    <w:bookmarkEnd w:id="188"/>
-    <w:bookmarkStart w:id="189" w:name="recommandations-opérationnelles"/>
+    <w:bookmarkEnd w:id="189"/>
+    <w:bookmarkStart w:id="190" w:name="recommandations-opérationnelles"/>
     <w:p>
       <w:pPr>
         <w:pStyle w:val="Heading2"/>
@@ -23908,8 +24399,8 @@
         <w:t xml:space="preserve">critiques.</w:t>
       </w:r>
     </w:p>
-    <w:bookmarkEnd w:id="189"/>
-    <w:bookmarkStart w:id="190" w:name="perspectives-dévolution"/>
+    <w:bookmarkEnd w:id="190"/>
+    <w:bookmarkStart w:id="191" w:name="perspectives-dévolution"/>
     <w:p>
       <w:pPr>
         <w:pStyle w:val="Heading2"/>
@@ -24207,9 +24698,9 @@
         <w:br w:type="page"/>
       </w:r>
     </w:p>
-    <w:bookmarkEnd w:id="190"/>
     <w:bookmarkEnd w:id="191"/>
-    <w:bookmarkStart w:id="192" w:name="conclusion-générale"/>
+    <w:bookmarkEnd w:id="192"/>
+    <w:bookmarkStart w:id="193" w:name="conclusion-générale"/>
     <w:p>
       <w:pPr>
         <w:pStyle w:val="Heading1"/>
@@ -24632,13 +25123,7 @@
         <w:t xml:space="preserve">traçabilité complète</w:t>
       </w:r>
       <w:r>
-        <w:t xml:space="preserve">, le</w:t>
-      </w:r>
-      <w:r>
-        <w:t xml:space="preserve"> </w:t>
-      </w:r>
-      <w:r>
-        <w:t xml:space="preserve">tout pour un</w:t>
+        <w:t xml:space="preserve">, le tout pour un</w:t>
       </w:r>
       <w:r>
         <w:t xml:space="preserve"> </w:t>
@@ -24651,7 +25136,23 @@
         <w:t xml:space="preserve">coût de licence nul</w:t>
       </w:r>
       <w:r>
-        <w:t xml:space="preserve">. Sur le plan économique, l’investissement</w:t>
+        <w:t xml:space="preserve">. Le prototype a en outre été</w:t>
+      </w:r>
+      <w:r>
+        <w:t xml:space="preserve"> </w:t>
+      </w:r>
+      <w:r>
+        <w:rPr>
+          <w:bCs/>
+          <w:b/>
+        </w:rPr>
+        <w:t xml:space="preserve">déployé et validé en conditions réelles</w:t>
+      </w:r>
+      <w:r>
+        <w:t xml:space="preserve"> </w:t>
+      </w:r>
+      <w:r>
+        <w:t xml:space="preserve">: la découverte a recensé une soixantaine d’équipements, et une panne provoquée a été détectée en moins de deux minutes, déclenchant simultanément une notification Telegram et un e-mail — démonstration concrète de la chaîne d’alerte de bout en bout. Sur le plan économique, l’investissement</w:t>
       </w:r>
       <w:r>
         <w:t xml:space="preserve"> </w:t>
@@ -24870,8 +25371,8 @@
         <w:br w:type="page"/>
       </w:r>
     </w:p>
-    <w:bookmarkEnd w:id="192"/>
-    <w:bookmarkStart w:id="193" w:name="bibliographie"/>
+    <w:bookmarkEnd w:id="193"/>
+    <w:bookmarkStart w:id="194" w:name="bibliographie"/>
     <w:p>
       <w:pPr>
         <w:pStyle w:val="Heading1"/>
@@ -25386,8 +25887,8 @@
         <w:br w:type="page"/>
       </w:r>
     </w:p>
-    <w:bookmarkEnd w:id="193"/>
-    <w:bookmarkStart w:id="194" w:name="annexes"/>
+    <w:bookmarkEnd w:id="194"/>
+    <w:bookmarkStart w:id="195" w:name="annexes"/>
     <w:p>
       <w:pPr>
         <w:pStyle w:val="Heading1"/>
@@ -25768,7 +26269,7 @@
         <w:t xml:space="preserve">— FIN DU MÉMOIRE —</w:t>
       </w:r>
     </w:p>
-    <w:bookmarkEnd w:id="194"/>
+    <w:bookmarkEnd w:id="195"/>
     <w:sectPr>
       <w:headerReference w:type="default" r:id="rId12"/>
       <w:footerReference w:type="default" r:id="rId13"/>

</xml_diff>